<commit_message>
docs: mise a jour des guides utilisateurs (Word + PDF) — version 13 juin 2026
- Coach : priorite des disciplines (n°1 affichee sur l'accueil), photo recadree 512x512 auto, tarif libre sans minimum, documents cliquables, 'Enregistrer' global
- Admin & Super-Admin : recherche d'un coach + consultation/modification de son profil (mode administrateur)
- Tous : selecteur de langue (14 langues) et acces a l'aide (carte + bouton flottant)
- Rappels messagerie (pieces jointes <=1 Mo, suppression auto apres 1 mois) et notifications SMS

Co-Authored-By: Claude Opus 4.8 <noreply@anthropic.com>
</commit_message>
<xml_diff>
--- a/guides/Guide-Admin-EduWeb.docx
+++ b/guides/Guide-Admin-EduWeb.docx
@@ -92,7 +92,7 @@
           <w:sz w:val="16"/>
           <w:szCs w:val="16"/>
         </w:rPr>
-        <w:t xml:space="preserve">Version du 12 juin 2026</w:t>
+        <w:t xml:space="preserve">Version du 13 juin 2026</w:t>
       </w:r>
     </w:p>
     <w:p>
@@ -104,7 +104,7 @@
           <w:sz w:val="22"/>
           <w:szCs w:val="22"/>
         </w:rPr>
-        <w:t xml:space="preserve">L'administrateur pilote la plateforme selon les permissions qui lui sont accordées par le super-administrateur : Gestion des utilisateurs, Validation des coachs et/ou Finances. Ce guide décrit les tâches courantes de l'administration.</w:t>
+        <w:t xml:space="preserve">L'administrateur pilote la plateforme selon les permissions accordées par le super-administrateur : Gestion des utilisateurs, Validation des coachs et/ou Finances. Ce guide décrit les tâches courantes, dont la recherche et la modification du profil d'un coach.</w:t>
       </w:r>
     </w:p>
     <w:p>
@@ -146,7 +146,7 @@
           <w:sz w:val="22"/>
           <w:szCs w:val="22"/>
         </w:rPr>
-        <w:t xml:space="preserve">Trois permissions peuvent vous être attribuées : Gestion des utilisateurs, Validation des coachs, Finances &amp; statistiques. Vous ne voyez que les espaces correspondant à vos permissions.</w:t>
+        <w:t xml:space="preserve">Trois permissions possibles : Gestion des utilisateurs, Validation des coachs, Finances &amp; statistiques. Vous ne voyez que les espaces correspondant à vos permissions.</w:t>
       </w:r>
     </w:p>
     <w:p>
@@ -154,6 +154,63 @@
         <w:pStyle w:val="Heading1"/>
       </w:pPr>
       <w:r>
+        <w:t xml:space="preserve">Langue de lecture</w:t>
+      </w:r>
+    </w:p>
+    <w:p>
+      <w:pPr>
+        <w:spacing w:after="120"/>
+      </w:pPr>
+      <w:r>
+        <w:rPr>
+          <w:sz w:val="22"/>
+          <w:szCs w:val="22"/>
+        </w:rPr>
+        <w:t xml:space="preserve">L'application est disponible en 14 langues. Sur votre tableau de bord, la carte « Langue de lecture » permet de choisir la langue d'affichage ; votre choix est mémorisé pour vos prochaines visites.</w:t>
+      </w:r>
+    </w:p>
+    <w:p>
+      <w:pPr>
+        <w:pStyle w:val="ListParagraph"/>
+        <w:numPr>
+          <w:ilvl w:val="0"/>
+          <w:numId w:val="2"/>
+        </w:numPr>
+        <w:spacing w:after="40"/>
+      </w:pPr>
+      <w:r>
+        <w:rPr>
+          <w:sz w:val="22"/>
+          <w:szCs w:val="22"/>
+        </w:rPr>
+        <w:t xml:space="preserve">Français, Anglais, Arabe, Espagnol, Coréen, Mandarin (chinois), Russe, Ukrainien, Allemand, Portugais, Italien, Turc, Wolof, Swahili.</w:t>
+      </w:r>
+    </w:p>
+    <w:p>
+      <w:pPr>
+        <w:pStyle w:val="Heading1"/>
+      </w:pPr>
+      <w:r>
+        <w:t xml:space="preserve">Besoin d'aide ?</w:t>
+      </w:r>
+    </w:p>
+    <w:p>
+      <w:pPr>
+        <w:spacing w:after="120"/>
+      </w:pPr>
+      <w:r>
+        <w:rPr>
+          <w:sz w:val="22"/>
+          <w:szCs w:val="22"/>
+        </w:rPr>
+        <w:t xml:space="preserve">Une carte « Besoin d'aide ? » figure sur votre tableau de bord, et un bouton flottant « Aide » (en bas à droite de l'écran) vous permet d'ouvrir ce guide à tout moment.</w:t>
+      </w:r>
+    </w:p>
+    <w:p>
+      <w:pPr>
+        <w:pStyle w:val="Heading1"/>
+      </w:pPr>
+      <w:r>
         <w:t xml:space="preserve">2. Gestion des utilisateurs</w:t>
       </w:r>
     </w:p>
@@ -200,24 +257,7 @@
           <w:sz w:val="22"/>
           <w:szCs w:val="22"/>
         </w:rPr>
-        <w:t xml:space="preserve">Créer un utilisateur : le compte est activé immédiatement (sans email de vérification).</w:t>
-      </w:r>
-    </w:p>
-    <w:p>
-      <w:pPr>
-        <w:pStyle w:val="ListParagraph"/>
-        <w:numPr>
-          <w:ilvl w:val="0"/>
-          <w:numId w:val="2"/>
-        </w:numPr>
-        <w:spacing w:after="40"/>
-      </w:pPr>
-      <w:r>
-        <w:rPr>
-          <w:sz w:val="22"/>
-          <w:szCs w:val="22"/>
-        </w:rPr>
-        <w:t xml:space="preserve">Changer le rôle d'un compte, le suspendre ou le réactiver, ou le supprimer (avec toutes ses données liées).</w:t>
+        <w:t xml:space="preserve">Créer un utilisateur (activé immédiatement), changer son rôle, le suspendre/réactiver, ou le supprimer (avec ses données liées).</w:t>
       </w:r>
     </w:p>
     <w:p>
@@ -237,7 +277,7 @@
           <w:sz w:val="22"/>
           <w:szCs w:val="22"/>
         </w:rPr>
-        <w:t xml:space="preserve">Cochez plusieurs comptes (ou utilisez « tout sélectionner »), puis appliquez une action groupée : Réactiver, Suspendre ou Supprimer. Vous ne pouvez pas agir sur votre propre compte.</w:t>
+        <w:t xml:space="preserve">Cochez plusieurs comptes (ou « tout sélectionner »), puis appliquez une action groupée : Réactiver, Suspendre ou Supprimer. Vous ne pouvez pas agir sur votre propre compte.</w:t>
       </w:r>
     </w:p>
     <w:p>
@@ -245,7 +285,7 @@
         <w:pStyle w:val="Heading1"/>
       </w:pPr>
       <w:r>
-        <w:t xml:space="preserve">3. Validation des profils coachs</w:t>
+        <w:t xml:space="preserve">3. Coachs : rechercher, consulter, modifier</w:t>
       </w:r>
     </w:p>
     <w:p>
@@ -257,58 +297,100 @@
           <w:sz w:val="22"/>
           <w:szCs w:val="22"/>
         </w:rPr>
-        <w:t xml:space="preserve">Permission requise : « Validation des coachs ».</w:t>
-      </w:r>
-    </w:p>
-    <w:p>
-      <w:pPr>
-        <w:pStyle w:val="ListParagraph"/>
-        <w:numPr>
-          <w:ilvl w:val="0"/>
-          <w:numId w:val="2"/>
-        </w:numPr>
-        <w:spacing w:after="40"/>
-      </w:pPr>
-      <w:r>
-        <w:rPr>
-          <w:sz w:val="22"/>
-          <w:szCs w:val="22"/>
-        </w:rPr>
-        <w:t xml:space="preserve">Examinez un profil : identité, zone d'intervention, compétences, disciplines et documents fournis.</w:t>
-      </w:r>
-    </w:p>
-    <w:p>
-      <w:pPr>
-        <w:pStyle w:val="ListParagraph"/>
-        <w:numPr>
-          <w:ilvl w:val="0"/>
-          <w:numId w:val="2"/>
-        </w:numPr>
-        <w:spacing w:after="40"/>
-      </w:pPr>
-      <w:r>
-        <w:rPr>
-          <w:sz w:val="22"/>
-          <w:szCs w:val="22"/>
-        </w:rPr>
-        <w:t xml:space="preserve">Validez le profil, ou refusez-le avec un motif (au moins 10 caractères).</w:t>
-      </w:r>
-    </w:p>
-    <w:p>
-      <w:pPr>
-        <w:pStyle w:val="ListParagraph"/>
-        <w:numPr>
-          <w:ilvl w:val="0"/>
-          <w:numId w:val="2"/>
-        </w:numPr>
-        <w:spacing w:after="40"/>
-      </w:pPr>
-      <w:r>
-        <w:rPr>
-          <w:sz w:val="22"/>
-          <w:szCs w:val="22"/>
-        </w:rPr>
-        <w:t xml:space="preserve">Vous pouvez certifier (ou retirer la certification d') un coach.</w:t>
+        <w:t xml:space="preserve">Permission requise : « Validation des coachs ». Le bouton « Coachs » du tableau de bord ouvre la recherche.</w:t>
+      </w:r>
+    </w:p>
+    <w:p>
+      <w:pPr>
+        <w:pStyle w:val="ListParagraph"/>
+        <w:numPr>
+          <w:ilvl w:val="0"/>
+          <w:numId w:val="2"/>
+        </w:numPr>
+        <w:spacing w:after="40"/>
+      </w:pPr>
+      <w:r>
+        <w:rPr>
+          <w:sz w:val="22"/>
+          <w:szCs w:val="22"/>
+        </w:rPr>
+        <w:t xml:space="preserve">Recherchez un coach par nom ou email ; chaque résultat indique son statut et sa certification.</w:t>
+      </w:r>
+    </w:p>
+    <w:p>
+      <w:pPr>
+        <w:pStyle w:val="ListParagraph"/>
+        <w:numPr>
+          <w:ilvl w:val="0"/>
+          <w:numId w:val="2"/>
+        </w:numPr>
+        <w:spacing w:after="40"/>
+      </w:pPr>
+      <w:r>
+        <w:rPr>
+          <w:sz w:val="22"/>
+          <w:szCs w:val="22"/>
+        </w:rPr>
+        <w:t xml:space="preserve">Consulter : ouvre la fiche d'examen (identité, zone, compétences, disciplines, documents).</w:t>
+      </w:r>
+    </w:p>
+    <w:p>
+      <w:pPr>
+        <w:pStyle w:val="ListParagraph"/>
+        <w:numPr>
+          <w:ilvl w:val="0"/>
+          <w:numId w:val="2"/>
+        </w:numPr>
+        <w:spacing w:after="40"/>
+      </w:pPr>
+      <w:r>
+        <w:rPr>
+          <w:sz w:val="22"/>
+          <w:szCs w:val="22"/>
+        </w:rPr>
+        <w:t xml:space="preserve">Modifier : ouvre le profil complet du coach en mode administrateur — vous pouvez mettre à jour ses 6 sections (identité, zone, compétences, disciplines &amp; tarifs, documents, présentation), sa photo et la priorité de ses disciplines, au nom du coach.</w:t>
+      </w:r>
+    </w:p>
+    <w:p>
+      <w:pPr>
+        <w:pStyle w:val="Heading2"/>
+      </w:pPr>
+      <w:r>
+        <w:t xml:space="preserve">Validation</w:t>
+      </w:r>
+    </w:p>
+    <w:p>
+      <w:pPr>
+        <w:pStyle w:val="ListParagraph"/>
+        <w:numPr>
+          <w:ilvl w:val="0"/>
+          <w:numId w:val="2"/>
+        </w:numPr>
+        <w:spacing w:after="40"/>
+      </w:pPr>
+      <w:r>
+        <w:rPr>
+          <w:sz w:val="22"/>
+          <w:szCs w:val="22"/>
+        </w:rPr>
+        <w:t xml:space="preserve">Depuis la fiche d'examen : Valider le profil, ou Refuser avec un motif (au moins 10 caractères).</w:t>
+      </w:r>
+    </w:p>
+    <w:p>
+      <w:pPr>
+        <w:pStyle w:val="ListParagraph"/>
+        <w:numPr>
+          <w:ilvl w:val="0"/>
+          <w:numId w:val="2"/>
+        </w:numPr>
+        <w:spacing w:after="40"/>
+      </w:pPr>
+      <w:r>
+        <w:rPr>
+          <w:sz w:val="22"/>
+          <w:szCs w:val="22"/>
+        </w:rPr>
+        <w:t xml:space="preserve">Certifier (ou retirer la certification d') un coach.</w:t>
       </w:r>
     </w:p>
     <w:p>
@@ -338,7 +420,7 @@
           <w:sz w:val="21"/>
           <w:szCs w:val="21"/>
         </w:rPr>
-        <w:t xml:space="preserve">Les tarifs et prétentions des coachs ne sont visibles que par l'administration ; les parents ne voient que les informations publiques.</w:t>
+        <w:t xml:space="preserve">Les tarifs et prétentions des coachs ne sont visibles que par l'administration.</w:t>
       </w:r>
     </w:p>
     <w:p>
@@ -375,24 +457,24 @@
           <w:sz w:val="22"/>
           <w:szCs w:val="22"/>
         </w:rPr>
-        <w:t xml:space="preserve">La page Commissions présente le récapitulatif des commissions à payer, regroupées par parrain (filleul concerné, mission, montant).</w:t>
-      </w:r>
-    </w:p>
-    <w:p>
-      <w:pPr>
-        <w:pStyle w:val="ListParagraph"/>
-        <w:numPr>
-          <w:ilvl w:val="0"/>
-          <w:numId w:val="2"/>
-        </w:numPr>
-        <w:spacing w:after="40"/>
-      </w:pPr>
-      <w:r>
-        <w:rPr>
-          <w:sz w:val="22"/>
-          <w:szCs w:val="22"/>
-        </w:rPr>
-        <w:t xml:space="preserve">Marquez une commission comme « payée », ou réglez en une fois toutes les commissions d'un parrain, avant de procéder au versement réel via Mobile Money.</w:t>
+        <w:t xml:space="preserve">La page Commissions présente le récapitulatif des commissions à payer, regroupées par parrain.</w:t>
+      </w:r>
+    </w:p>
+    <w:p>
+      <w:pPr>
+        <w:pStyle w:val="ListParagraph"/>
+        <w:numPr>
+          <w:ilvl w:val="0"/>
+          <w:numId w:val="2"/>
+        </w:numPr>
+        <w:spacing w:after="40"/>
+      </w:pPr>
+      <w:r>
+        <w:rPr>
+          <w:sz w:val="22"/>
+          <w:szCs w:val="22"/>
+        </w:rPr>
+        <w:t xml:space="preserve">Marquez une commission « payée », ou réglez en une fois toutes celles d'un parrain, avant le versement réel via Mobile Money.</w:t>
       </w:r>
     </w:p>
     <w:p>
@@ -412,7 +494,7 @@
           <w:sz w:val="22"/>
           <w:szCs w:val="22"/>
         </w:rPr>
-        <w:t xml:space="preserve">L'administrateur peut échanger avec tous les utilisateurs. Les utilisateurs, eux, écrivent au « Support ».</w:t>
+        <w:t xml:space="preserve">L'administrateur peut échanger avec tous les utilisateurs. Les utilisateurs écrivent au « Support ».</w:t>
       </w:r>
     </w:p>
     <w:p>

</xml_diff>

<commit_message>
docs: guides utilisateurs — ajout de la procedure d'installation de la PWA
Nouvelle section « Installer l'application sur votre appareil » dans les 5
guides (Parent, Coach, Commercial, Admin, Super-Admin), formats Word + PDF :
etapes d'installation Android (Chrome), iPhone/iPad (Safari) et ordinateur
(Chrome/Edge), comportement hors-ligne. Version du 13 juin 2026.

Co-Authored-By: Claude Fable 5 <noreply@anthropic.com>
</commit_message>
<xml_diff>
--- a/guides/Guide-Admin-EduWeb.docx
+++ b/guides/Guide-Admin-EduWeb.docx
@@ -204,6 +204,245 @@
           <w:szCs w:val="22"/>
         </w:rPr>
         <w:t xml:space="preserve">Une carte « Besoin d'aide ? » figure sur votre tableau de bord, et un bouton flottant « Aide » (en bas à droite de l'écran) vous permet d'ouvrir ce guide à tout moment.</w:t>
+      </w:r>
+    </w:p>
+    <w:p>
+      <w:pPr>
+        <w:pStyle w:val="Heading1"/>
+      </w:pPr>
+      <w:r>
+        <w:t xml:space="preserve">Installer l'application sur votre appareil</w:t>
+      </w:r>
+    </w:p>
+    <w:p>
+      <w:pPr>
+        <w:spacing w:after="120"/>
+      </w:pPr>
+      <w:r>
+        <w:rPr>
+          <w:sz w:val="22"/>
+          <w:szCs w:val="22"/>
+        </w:rPr>
+        <w:t xml:space="preserve">EduWeb est une application web installable : vous pouvez l'ajouter à l'écran d'accueil de votre téléphone ou au bureau de votre ordinateur, puis l'ouvrir comme une application classique — en plein écran, sans la barre du navigateur, avec l'icône EduWeb. L'installation est gratuite, rapide et ne passe par aucun magasin d'applications.</w:t>
+      </w:r>
+    </w:p>
+    <w:p>
+      <w:pPr>
+        <w:pStyle w:val="Heading2"/>
+      </w:pPr>
+      <w:r>
+        <w:t xml:space="preserve">Android (Chrome)</w:t>
+      </w:r>
+    </w:p>
+    <w:p>
+      <w:pPr>
+        <w:pStyle w:val="ListParagraph"/>
+        <w:numPr>
+          <w:ilvl w:val="0"/>
+          <w:numId w:val="3"/>
+        </w:numPr>
+        <w:spacing w:after="40"/>
+      </w:pPr>
+      <w:r>
+        <w:rPr>
+          <w:sz w:val="22"/>
+          <w:szCs w:val="22"/>
+        </w:rPr>
+        <w:t xml:space="preserve">Ouvrez family.eduweb.ci dans Chrome.</w:t>
+      </w:r>
+    </w:p>
+    <w:p>
+      <w:pPr>
+        <w:pStyle w:val="ListParagraph"/>
+        <w:numPr>
+          <w:ilvl w:val="0"/>
+          <w:numId w:val="3"/>
+        </w:numPr>
+        <w:spacing w:after="40"/>
+      </w:pPr>
+      <w:r>
+        <w:rPr>
+          <w:sz w:val="22"/>
+          <w:szCs w:val="22"/>
+        </w:rPr>
+        <w:t xml:space="preserve">Touchez la bannière « Installer l'application » si elle apparaît ; sinon, ouvrez le menu ⋮ (en haut à droite).</w:t>
+      </w:r>
+    </w:p>
+    <w:p>
+      <w:pPr>
+        <w:pStyle w:val="ListParagraph"/>
+        <w:numPr>
+          <w:ilvl w:val="0"/>
+          <w:numId w:val="3"/>
+        </w:numPr>
+        <w:spacing w:after="40"/>
+      </w:pPr>
+      <w:r>
+        <w:rPr>
+          <w:sz w:val="22"/>
+          <w:szCs w:val="22"/>
+        </w:rPr>
+        <w:t xml:space="preserve">Choisissez « Installer l'application » (ou « Ajouter à l'écran d'accueil »), puis confirmez.</w:t>
+      </w:r>
+    </w:p>
+    <w:p>
+      <w:pPr>
+        <w:pStyle w:val="Heading2"/>
+      </w:pPr>
+      <w:r>
+        <w:t xml:space="preserve">iPhone / iPad (Safari)</w:t>
+      </w:r>
+    </w:p>
+    <w:p>
+      <w:pPr>
+        <w:pStyle w:val="ListParagraph"/>
+        <w:numPr>
+          <w:ilvl w:val="0"/>
+          <w:numId w:val="4"/>
+        </w:numPr>
+        <w:spacing w:after="40"/>
+      </w:pPr>
+      <w:r>
+        <w:rPr>
+          <w:sz w:val="22"/>
+          <w:szCs w:val="22"/>
+        </w:rPr>
+        <w:t xml:space="preserve">Ouvrez family.eduweb.ci dans Safari.</w:t>
+      </w:r>
+    </w:p>
+    <w:p>
+      <w:pPr>
+        <w:pStyle w:val="ListParagraph"/>
+        <w:numPr>
+          <w:ilvl w:val="0"/>
+          <w:numId w:val="4"/>
+        </w:numPr>
+        <w:spacing w:after="40"/>
+      </w:pPr>
+      <w:r>
+        <w:rPr>
+          <w:sz w:val="22"/>
+          <w:szCs w:val="22"/>
+        </w:rPr>
+        <w:t xml:space="preserve">Touchez le bouton Partager (le carré surmonté d'une flèche vers le haut).</w:t>
+      </w:r>
+    </w:p>
+    <w:p>
+      <w:pPr>
+        <w:pStyle w:val="ListParagraph"/>
+        <w:numPr>
+          <w:ilvl w:val="0"/>
+          <w:numId w:val="4"/>
+        </w:numPr>
+        <w:spacing w:after="40"/>
+      </w:pPr>
+      <w:r>
+        <w:rPr>
+          <w:sz w:val="22"/>
+          <w:szCs w:val="22"/>
+        </w:rPr>
+        <w:t xml:space="preserve">Faites défiler, choisissez « Sur l'écran d'accueil », puis « Ajouter ».</w:t>
+      </w:r>
+    </w:p>
+    <w:p>
+      <w:pPr>
+        <w:pStyle w:val="Heading2"/>
+      </w:pPr>
+      <w:r>
+        <w:t xml:space="preserve">Ordinateur (Chrome ou Edge)</w:t>
+      </w:r>
+    </w:p>
+    <w:p>
+      <w:pPr>
+        <w:pStyle w:val="ListParagraph"/>
+        <w:numPr>
+          <w:ilvl w:val="0"/>
+          <w:numId w:val="5"/>
+        </w:numPr>
+        <w:spacing w:after="40"/>
+      </w:pPr>
+      <w:r>
+        <w:rPr>
+          <w:sz w:val="22"/>
+          <w:szCs w:val="22"/>
+        </w:rPr>
+        <w:t xml:space="preserve">Ouvrez family.eduweb.ci.</w:t>
+      </w:r>
+    </w:p>
+    <w:p>
+      <w:pPr>
+        <w:pStyle w:val="ListParagraph"/>
+        <w:numPr>
+          <w:ilvl w:val="0"/>
+          <w:numId w:val="5"/>
+        </w:numPr>
+        <w:spacing w:after="40"/>
+      </w:pPr>
+      <w:r>
+        <w:rPr>
+          <w:sz w:val="22"/>
+          <w:szCs w:val="22"/>
+        </w:rPr>
+        <w:t xml:space="preserve">Cliquez sur l'icône d'installation (un écran avec une flèche, ou ⊕) à droite de la barre d'adresse.</w:t>
+      </w:r>
+    </w:p>
+    <w:p>
+      <w:pPr>
+        <w:pStyle w:val="ListParagraph"/>
+        <w:numPr>
+          <w:ilvl w:val="0"/>
+          <w:numId w:val="5"/>
+        </w:numPr>
+        <w:spacing w:after="40"/>
+      </w:pPr>
+      <w:r>
+        <w:rPr>
+          <w:sz w:val="22"/>
+          <w:szCs w:val="22"/>
+        </w:rPr>
+        <w:t xml:space="preserve">Cliquez sur « Installer ».</w:t>
+      </w:r>
+    </w:p>
+    <w:p>
+      <w:pPr>
+        <w:spacing w:after="120"/>
+      </w:pPr>
+      <w:r>
+        <w:rPr>
+          <w:sz w:val="22"/>
+          <w:szCs w:val="22"/>
+        </w:rPr>
+        <w:t xml:space="preserve">Une fois installée, l'icône EduWeb apparaît sur votre écran d'accueil (ou votre bureau) et l'application se met à jour automatiquement à chaque connexion à Internet.</w:t>
+      </w:r>
+    </w:p>
+    <w:p>
+      <w:pPr>
+        <w:pBdr>
+          <w:top w:val="single" w:color="B8DCC6" w:sz="2" w:space="6"/>
+          <w:bottom w:val="single" w:color="B8DCC6" w:sz="2" w:space="6"/>
+          <w:left w:val="single" w:color="1E9E57" w:sz="18" w:space="10"/>
+          <w:right w:val="single" w:color="B8DCC6" w:sz="2" w:space="6"/>
+        </w:pBdr>
+        <w:shd w:fill="E8F5EC" w:val="clear"/>
+        <w:spacing w:after="140" w:before="80"/>
+      </w:pPr>
+      <w:r>
+        <w:rPr>
+          <w:b/>
+          <w:bCs/>
+          <w:color w:val="0E6B3A"/>
+          <w:sz w:val="21"/>
+          <w:szCs w:val="21"/>
+        </w:rPr>
+        <w:t xml:space="preserve">À noter — </w:t>
+      </w:r>
+      <w:r>
+        <w:rPr>
+          <w:color w:val="1A3A28"/>
+          <w:sz w:val="21"/>
+          <w:szCs w:val="21"/>
+        </w:rPr>
+        <w:t xml:space="preserve">En cas de coupure d'Internet, l'application affiche une page d'attente claire et se recharge automatiquement dès le retour de la connexion. La consultation des pages nécessite une connexion active.</w:t>
       </w:r>
     </w:p>
     <w:p>
@@ -765,6 +1004,42 @@
       </w:pPr>
     </w:lvl>
   </w:abstractNum>
+  <w:abstractNum w:abstractNumId="3" w15:restartNumberingAfterBreak="0">
+    <w:multiLevelType w:val="hybridMultilevel"/>
+    <w:lvl w:ilvl="0" w15:tentative="1">
+      <w:start w:val="1"/>
+      <w:numFmt w:val="decimal"/>
+      <w:lvlText w:val="%1."/>
+      <w:lvlJc w:val="left"/>
+      <w:pPr>
+        <w:ind w:left="540" w:hanging="300"/>
+      </w:pPr>
+    </w:lvl>
+  </w:abstractNum>
+  <w:abstractNum w:abstractNumId="4" w15:restartNumberingAfterBreak="0">
+    <w:multiLevelType w:val="hybridMultilevel"/>
+    <w:lvl w:ilvl="0" w15:tentative="1">
+      <w:start w:val="1"/>
+      <w:numFmt w:val="decimal"/>
+      <w:lvlText w:val="%1."/>
+      <w:lvlJc w:val="left"/>
+      <w:pPr>
+        <w:ind w:left="540" w:hanging="300"/>
+      </w:pPr>
+    </w:lvl>
+  </w:abstractNum>
+  <w:abstractNum w:abstractNumId="5" w15:restartNumberingAfterBreak="0">
+    <w:multiLevelType w:val="hybridMultilevel"/>
+    <w:lvl w:ilvl="0" w15:tentative="1">
+      <w:start w:val="1"/>
+      <w:numFmt w:val="decimal"/>
+      <w:lvlText w:val="%1."/>
+      <w:lvlJc w:val="left"/>
+      <w:pPr>
+        <w:ind w:left="540" w:hanging="300"/>
+      </w:pPr>
+    </w:lvl>
+  </w:abstractNum>
   <w:num w:numId="1">
     <w:abstractNumId w:val="1"/>
     <w:lvlOverride w:ilvl="0">
@@ -773,6 +1048,24 @@
   </w:num>
   <w:num w:numId="2">
     <w:abstractNumId w:val="2"/>
+    <w:lvlOverride w:ilvl="0">
+      <w:startOverride w:val="1"/>
+    </w:lvlOverride>
+  </w:num>
+  <w:num w:numId="3">
+    <w:abstractNumId w:val="3"/>
+    <w:lvlOverride w:ilvl="0">
+      <w:startOverride w:val="1"/>
+    </w:lvlOverride>
+  </w:num>
+  <w:num w:numId="4">
+    <w:abstractNumId w:val="4"/>
+    <w:lvlOverride w:ilvl="0">
+      <w:startOverride w:val="1"/>
+    </w:lvlOverride>
+  </w:num>
+  <w:num w:numId="5">
+    <w:abstractNumId w:val="5"/>
     <w:lvlOverride w:ilvl="0">
       <w:startOverride w:val="1"/>
     </w:lvlOverride>

</xml_diff>

<commit_message>
docs: guides mis a jour (code promo, Connaissances generales, refus groupe, espace de jeu)
Regeneration des 5 guides (Word + PDF), version 15 juin 2026 :
- Parent : code promo (EDU10->EDU100, remise au paiement) + section Espace de jeu.
- Coach : niveau transversal "Connaissances generales" (specialites, tarif).
- Admin : refus groupe de coachs au meme motif.
- Super-Admin : mention du refus groupe.
- Section "Installer l'application" (PWA) conservee dans les 5 guides.

Co-Authored-By: Claude Fable 5 <noreply@anthropic.com>
</commit_message>
<xml_diff>
--- a/guides/Guide-Admin-EduWeb.docx
+++ b/guides/Guide-Admin-EduWeb.docx
@@ -92,7 +92,7 @@
           <w:sz w:val="16"/>
           <w:szCs w:val="16"/>
         </w:rPr>
-        <w:t xml:space="preserve">Version du 13 juin 2026</w:t>
+        <w:t xml:space="preserve">Version du 15 juin 2026</w:t>
       </w:r>
     </w:p>
     <w:p>
@@ -630,6 +630,26 @@
           <w:szCs w:val="22"/>
         </w:rPr>
         <w:t xml:space="preserve">Certifier (ou retirer la certification d') un coach.</w:t>
+      </w:r>
+    </w:p>
+    <w:p>
+      <w:pPr>
+        <w:pStyle w:val="Heading2"/>
+      </w:pPr>
+      <w:r>
+        <w:t xml:space="preserve">Refus groupé (au même motif)</w:t>
+      </w:r>
+    </w:p>
+    <w:p>
+      <w:pPr>
+        <w:spacing w:after="120"/>
+      </w:pPr>
+      <w:r>
+        <w:rPr>
+          <w:sz w:val="22"/>
+          <w:szCs w:val="22"/>
+        </w:rPr>
+        <w:t xml:space="preserve">Sur le tableau de bord, dans la liste « Coachs en attente de validation », cochez plusieurs coachs (ou « tout sélectionner »). Une barre apparaît : saisissez un motif commun (au moins 10 caractères) et cliquez « Refuser la sélection » pour refuser tous les coachs cochés en une seule action, avec le même motif. Pratique lorsque plusieurs candidatures sont refusées pour la même raison (ex. dossier incomplet).</w:t>
       </w:r>
     </w:p>
     <w:p>

</xml_diff>

<commit_message>
docs(guides): refonte didactique des 5 guides (PDF + Word)
Meme charte academique que le support de formation :
- Page de couverture (pastille de role), sommaire pagine.
- Chapitres auto-numerotes a badge, encadres couleur (a noter/astuce/attention).
- Etapes en pastilles numerotees, puces, bloc d'intro « A propos ».
- Word : table des matieres automatique (champ mis a jour a l'ouverture),
  titres stylises, format A4.
- Correction : la section « Installer l'application » (PWA) etait definie
  mais plus referencee dans les guides ; elle est retablie dans les 5.

Genere par scripts/build-guides.js.

Co-Authored-By: Claude Opus 4.8 (1M context) <noreply@anthropic.com>
</commit_message>
<xml_diff>
--- a/guides/Guide-Admin-EduWeb.docx
+++ b/guides/Guide-Admin-EduWeb.docx
@@ -4,7 +4,7 @@
   <w:body>
     <w:p>
       <w:pPr>
-        <w:spacing w:after="0"/>
+        <w:spacing w:after="0" w:before="1400"/>
         <w:jc w:val="center"/>
       </w:pPr>
       <w:r>
@@ -12,425 +12,508 @@
           <w:b/>
           <w:bCs/>
           <w:color w:val="0E6B3A"/>
-          <w:sz w:val="56"/>
-          <w:szCs w:val="56"/>
+          <w:sz w:val="64"/>
+          <w:szCs w:val="64"/>
         </w:rPr>
         <w:t xml:space="preserve">EduWeb</w:t>
       </w:r>
     </w:p>
     <w:p>
       <w:pPr>
-        <w:spacing w:after="200"/>
+        <w:spacing w:after="700"/>
         <w:jc w:val="center"/>
       </w:pPr>
       <w:r>
         <w:rPr>
           <w:color w:val="1E9E57"/>
+          <w:spacing w:val="30"/>
+          <w:sz w:val="18"/>
+          <w:szCs w:val="18"/>
+        </w:rPr>
+        <w:t xml:space="preserve">FAMILY &amp; COACHING</w:t>
+      </w:r>
+    </w:p>
+    <w:p>
+      <w:pPr>
+        <w:spacing w:after="120"/>
+        <w:jc w:val="center"/>
+      </w:pPr>
+      <w:r>
+        <w:rPr>
+          <w:color w:val="1E9E57"/>
+          <w:spacing w:val="40"/>
+          <w:sz w:val="22"/>
+          <w:szCs w:val="22"/>
+        </w:rPr>
+        <w:t xml:space="preserve">GUIDE DE L'UTILISATEUR</w:t>
+      </w:r>
+    </w:p>
+    <w:p>
+      <w:pPr>
+        <w:shd w:fill="0E6B3A" w:color="auto" w:val="clear"/>
+        <w:spacing w:after="200" w:before="120"/>
+        <w:jc w:val="center"/>
+      </w:pPr>
+      <w:r>
+        <w:rPr>
+          <w:b/>
+          <w:bCs/>
+          <w:color w:val="FFFFFF"/>
+          <w:sz w:val="44"/>
+          <w:szCs w:val="44"/>
+        </w:rPr>
+        <w:t xml:space="preserve">  Admin  </w:t>
+      </w:r>
+    </w:p>
+    <w:p>
+      <w:pPr>
+        <w:spacing w:after="80"/>
+        <w:jc w:val="center"/>
+      </w:pPr>
+      <w:r>
+        <w:rPr>
+          <w:i/>
+          <w:iCs/>
+          <w:color w:val="666666"/>
+          <w:sz w:val="24"/>
+          <w:szCs w:val="24"/>
+        </w:rPr>
+        <w:t xml:space="preserve">Pilotez la plateforme selon vos permissions</w:t>
+      </w:r>
+    </w:p>
+    <w:p>
+      <w:pPr>
+        <w:pBdr>
+          <w:top w:val="single" w:color="1E9E57" w:sz="6" w:space="8"/>
+        </w:pBdr>
+        <w:spacing w:after="0" w:before="200"/>
+        <w:jc w:val="center"/>
+      </w:pPr>
+      <w:r>
+        <w:rPr>
+          <w:color w:val="999999"/>
+          <w:sz w:val="18"/>
+          <w:szCs w:val="18"/>
+        </w:rPr>
+        <w:t xml:space="preserve">Document de formation</w:t>
+      </w:r>
+    </w:p>
+    <w:p>
+      <w:pPr>
+        <w:spacing w:after="0"/>
+        <w:jc w:val="center"/>
+      </w:pPr>
+      <w:r>
+        <w:rPr>
+          <w:color w:val="999999"/>
           <w:sz w:val="16"/>
           <w:szCs w:val="16"/>
         </w:rPr>
-        <w:t xml:space="preserve">FAMILY &amp; COACHING</w:t>
-      </w:r>
-    </w:p>
-    <w:p>
-      <w:pPr>
-        <w:spacing w:after="40"/>
-        <w:jc w:val="center"/>
-      </w:pPr>
-      <w:r>
-        <w:rPr>
-          <w:color w:val="555555"/>
-          <w:sz w:val="26"/>
-          <w:szCs w:val="26"/>
-        </w:rPr>
-        <w:t xml:space="preserve">Guide de l'utilisateur</w:t>
-      </w:r>
-    </w:p>
-    <w:p>
-      <w:pPr>
-        <w:spacing w:after="60"/>
-        <w:jc w:val="center"/>
+        <w:t xml:space="preserve">family.eduweb.ci · Version du 20 juin 2026</w:t>
+      </w:r>
+    </w:p>
+    <w:p>
+      <w:r>
+        <w:br w:type="page"/>
+      </w:r>
+    </w:p>
+    <w:p>
+      <w:pPr>
+        <w:pBdr>
+          <w:bottom w:val="single" w:color="1E9E57" w:sz="8" w:space="6"/>
+        </w:pBdr>
+        <w:spacing w:after="160"/>
       </w:pPr>
       <w:r>
         <w:rPr>
           <w:b/>
           <w:bCs/>
           <w:color w:val="0E6B3A"/>
-          <w:sz w:val="44"/>
-          <w:szCs w:val="44"/>
-        </w:rPr>
-        <w:t xml:space="preserve">Admin</w:t>
-      </w:r>
-    </w:p>
-    <w:p>
-      <w:pPr>
-        <w:spacing w:after="40"/>
-        <w:jc w:val="center"/>
-      </w:pPr>
-      <w:r>
-        <w:rPr>
-          <w:i/>
-          <w:iCs/>
-          <w:color w:val="666666"/>
-          <w:sz w:val="22"/>
-          <w:szCs w:val="22"/>
-        </w:rPr>
-        <w:t xml:space="preserve">Pilotez la plateforme selon vos permissions</w:t>
-      </w:r>
-    </w:p>
-    <w:p>
-      <w:pPr>
-        <w:pBdr>
-          <w:bottom w:val="single" w:color="1E9E57" w:sz="6" w:space="8"/>
-        </w:pBdr>
-        <w:spacing w:after="160"/>
-        <w:jc w:val="center"/>
-      </w:pPr>
-      <w:r>
-        <w:rPr>
-          <w:color w:val="999999"/>
-          <w:sz w:val="16"/>
-          <w:szCs w:val="16"/>
-        </w:rPr>
-        <w:t xml:space="preserve">Version du 15 juin 2026</w:t>
-      </w:r>
-    </w:p>
-    <w:p>
-      <w:pPr>
-        <w:spacing w:after="200"/>
-      </w:pPr>
-      <w:r>
-        <w:rPr>
-          <w:sz w:val="22"/>
-          <w:szCs w:val="22"/>
-        </w:rPr>
-        <w:t xml:space="preserve">L'administrateur pilote la plateforme selon les permissions accordées par le super-administrateur : Gestion des utilisateurs, Validation des coachs et/ou Finances. Ce guide décrit les tâches courantes, dont la recherche et la modification du profil d'un coach.</w:t>
-      </w:r>
-    </w:p>
-    <w:p>
-      <w:pPr>
-        <w:pStyle w:val="Heading1"/>
-      </w:pPr>
-      <w:r>
-        <w:t xml:space="preserve">1. Connexion et tableau de bord</w:t>
-      </w:r>
-    </w:p>
-    <w:p>
-      <w:pPr>
-        <w:pStyle w:val="ListParagraph"/>
-        <w:numPr>
-          <w:ilvl w:val="0"/>
-          <w:numId w:val="2"/>
-        </w:numPr>
-        <w:spacing w:after="40"/>
-      </w:pPr>
-      <w:r>
-        <w:rPr>
-          <w:sz w:val="22"/>
-          <w:szCs w:val="22"/>
-        </w:rPr>
-        <w:t xml:space="preserve">Le tableau de bord présente des statistiques en temps réel et des cartes interactives.</w:t>
-      </w:r>
-    </w:p>
-    <w:p>
-      <w:pPr>
-        <w:pStyle w:val="ListParagraph"/>
-        <w:numPr>
-          <w:ilvl w:val="0"/>
-          <w:numId w:val="2"/>
-        </w:numPr>
-        <w:spacing w:after="40"/>
-      </w:pPr>
-      <w:r>
-        <w:rPr>
-          <w:sz w:val="22"/>
-          <w:szCs w:val="22"/>
-        </w:rPr>
-        <w:t xml:space="preserve">Trois permissions possibles : Gestion des utilisateurs, Validation des coachs, Finances &amp; statistiques. Vous ne voyez que les espaces correspondant à vos permissions.</w:t>
-      </w:r>
-    </w:p>
-    <w:p>
-      <w:pPr>
-        <w:pStyle w:val="Heading1"/>
-      </w:pPr>
-      <w:r>
-        <w:t xml:space="preserve">Langue de lecture</w:t>
-      </w:r>
-    </w:p>
-    <w:p>
-      <w:pPr>
-        <w:spacing w:after="120"/>
-      </w:pPr>
-      <w:r>
-        <w:rPr>
-          <w:sz w:val="22"/>
-          <w:szCs w:val="22"/>
-        </w:rPr>
-        <w:t xml:space="preserve">L'application est disponible en 14 langues. Sur votre tableau de bord, la carte « Langue de lecture » permet de choisir la langue d'affichage ; votre choix est mémorisé pour vos prochaines visites.</w:t>
-      </w:r>
-    </w:p>
-    <w:p>
-      <w:pPr>
-        <w:pStyle w:val="ListParagraph"/>
-        <w:numPr>
-          <w:ilvl w:val="0"/>
-          <w:numId w:val="2"/>
-        </w:numPr>
-        <w:spacing w:after="40"/>
-      </w:pPr>
-      <w:r>
-        <w:rPr>
-          <w:sz w:val="22"/>
-          <w:szCs w:val="22"/>
-        </w:rPr>
-        <w:t xml:space="preserve">Français, Anglais, Arabe, Espagnol, Coréen, Mandarin (chinois), Russe, Ukrainien, Allemand, Portugais, Italien, Turc, Wolof, Swahili.</w:t>
-      </w:r>
-    </w:p>
-    <w:p>
-      <w:pPr>
-        <w:pStyle w:val="Heading1"/>
-      </w:pPr>
-      <w:r>
-        <w:t xml:space="preserve">Besoin d'aide ?</w:t>
-      </w:r>
-    </w:p>
-    <w:p>
-      <w:pPr>
-        <w:spacing w:after="120"/>
-      </w:pPr>
-      <w:r>
-        <w:rPr>
-          <w:sz w:val="22"/>
-          <w:szCs w:val="22"/>
-        </w:rPr>
-        <w:t xml:space="preserve">Une carte « Besoin d'aide ? » figure sur votre tableau de bord, et un bouton flottant « Aide » (en bas à droite de l'écran) vous permet d'ouvrir ce guide à tout moment.</w:t>
-      </w:r>
-    </w:p>
-    <w:p>
-      <w:pPr>
-        <w:pStyle w:val="Heading1"/>
-      </w:pPr>
-      <w:r>
-        <w:t xml:space="preserve">Installer l'application sur votre appareil</w:t>
-      </w:r>
-    </w:p>
-    <w:p>
-      <w:pPr>
-        <w:spacing w:after="120"/>
-      </w:pPr>
-      <w:r>
-        <w:rPr>
-          <w:sz w:val="22"/>
-          <w:szCs w:val="22"/>
-        </w:rPr>
-        <w:t xml:space="preserve">EduWeb est une application web installable : vous pouvez l'ajouter à l'écran d'accueil de votre téléphone ou au bureau de votre ordinateur, puis l'ouvrir comme une application classique — en plein écran, sans la barre du navigateur, avec l'icône EduWeb. L'installation est gratuite, rapide et ne passe par aucun magasin d'applications.</w:t>
-      </w:r>
-    </w:p>
-    <w:p>
-      <w:pPr>
-        <w:pStyle w:val="Heading2"/>
-      </w:pPr>
-      <w:r>
-        <w:t xml:space="preserve">Android (Chrome)</w:t>
-      </w:r>
-    </w:p>
-    <w:p>
-      <w:pPr>
-        <w:pStyle w:val="ListParagraph"/>
-        <w:numPr>
-          <w:ilvl w:val="0"/>
-          <w:numId w:val="3"/>
-        </w:numPr>
-        <w:spacing w:after="40"/>
-      </w:pPr>
-      <w:r>
-        <w:rPr>
-          <w:sz w:val="22"/>
-          <w:szCs w:val="22"/>
-        </w:rPr>
-        <w:t xml:space="preserve">Ouvrez family.eduweb.ci dans Chrome.</w:t>
-      </w:r>
-    </w:p>
-    <w:p>
-      <w:pPr>
-        <w:pStyle w:val="ListParagraph"/>
-        <w:numPr>
-          <w:ilvl w:val="0"/>
-          <w:numId w:val="3"/>
-        </w:numPr>
-        <w:spacing w:after="40"/>
-      </w:pPr>
-      <w:r>
-        <w:rPr>
-          <w:sz w:val="22"/>
-          <w:szCs w:val="22"/>
-        </w:rPr>
-        <w:t xml:space="preserve">Touchez la bannière « Installer l'application » si elle apparaît ; sinon, ouvrez le menu ⋮ (en haut à droite).</w:t>
-      </w:r>
-    </w:p>
-    <w:p>
-      <w:pPr>
-        <w:pStyle w:val="ListParagraph"/>
-        <w:numPr>
-          <w:ilvl w:val="0"/>
-          <w:numId w:val="3"/>
-        </w:numPr>
-        <w:spacing w:after="40"/>
-      </w:pPr>
-      <w:r>
-        <w:rPr>
-          <w:sz w:val="22"/>
-          <w:szCs w:val="22"/>
-        </w:rPr>
-        <w:t xml:space="preserve">Choisissez « Installer l'application » (ou « Ajouter à l'écran d'accueil »), puis confirmez.</w:t>
-      </w:r>
-    </w:p>
-    <w:p>
-      <w:pPr>
-        <w:pStyle w:val="Heading2"/>
-      </w:pPr>
-      <w:r>
-        <w:t xml:space="preserve">iPhone / iPad (Safari)</w:t>
-      </w:r>
-    </w:p>
-    <w:p>
-      <w:pPr>
-        <w:pStyle w:val="ListParagraph"/>
-        <w:numPr>
-          <w:ilvl w:val="0"/>
-          <w:numId w:val="4"/>
-        </w:numPr>
-        <w:spacing w:after="40"/>
-      </w:pPr>
-      <w:r>
-        <w:rPr>
-          <w:sz w:val="22"/>
-          <w:szCs w:val="22"/>
-        </w:rPr>
-        <w:t xml:space="preserve">Ouvrez family.eduweb.ci dans Safari.</w:t>
-      </w:r>
-    </w:p>
-    <w:p>
-      <w:pPr>
-        <w:pStyle w:val="ListParagraph"/>
-        <w:numPr>
-          <w:ilvl w:val="0"/>
-          <w:numId w:val="4"/>
-        </w:numPr>
-        <w:spacing w:after="40"/>
-      </w:pPr>
-      <w:r>
-        <w:rPr>
-          <w:sz w:val="22"/>
-          <w:szCs w:val="22"/>
-        </w:rPr>
-        <w:t xml:space="preserve">Touchez le bouton Partager (le carré surmonté d'une flèche vers le haut).</w:t>
-      </w:r>
-    </w:p>
-    <w:p>
-      <w:pPr>
-        <w:pStyle w:val="ListParagraph"/>
-        <w:numPr>
-          <w:ilvl w:val="0"/>
-          <w:numId w:val="4"/>
-        </w:numPr>
-        <w:spacing w:after="40"/>
-      </w:pPr>
-      <w:r>
-        <w:rPr>
-          <w:sz w:val="22"/>
-          <w:szCs w:val="22"/>
-        </w:rPr>
-        <w:t xml:space="preserve">Faites défiler, choisissez « Sur l'écran d'accueil », puis « Ajouter ».</w:t>
-      </w:r>
-    </w:p>
-    <w:p>
-      <w:pPr>
-        <w:pStyle w:val="Heading2"/>
-      </w:pPr>
-      <w:r>
-        <w:t xml:space="preserve">Ordinateur (Chrome ou Edge)</w:t>
-      </w:r>
-    </w:p>
-    <w:p>
-      <w:pPr>
-        <w:pStyle w:val="ListParagraph"/>
-        <w:numPr>
-          <w:ilvl w:val="0"/>
-          <w:numId w:val="5"/>
-        </w:numPr>
-        <w:spacing w:after="40"/>
-      </w:pPr>
-      <w:r>
-        <w:rPr>
-          <w:sz w:val="22"/>
-          <w:szCs w:val="22"/>
-        </w:rPr>
-        <w:t xml:space="preserve">Ouvrez family.eduweb.ci.</w:t>
-      </w:r>
-    </w:p>
-    <w:p>
-      <w:pPr>
-        <w:pStyle w:val="ListParagraph"/>
-        <w:numPr>
-          <w:ilvl w:val="0"/>
-          <w:numId w:val="5"/>
-        </w:numPr>
-        <w:spacing w:after="40"/>
-      </w:pPr>
-      <w:r>
-        <w:rPr>
-          <w:sz w:val="22"/>
-          <w:szCs w:val="22"/>
-        </w:rPr>
-        <w:t xml:space="preserve">Cliquez sur l'icône d'installation (un écran avec une flèche, ou ⊕) à droite de la barre d'adresse.</w:t>
-      </w:r>
-    </w:p>
-    <w:p>
-      <w:pPr>
-        <w:pStyle w:val="ListParagraph"/>
-        <w:numPr>
-          <w:ilvl w:val="0"/>
-          <w:numId w:val="5"/>
-        </w:numPr>
-        <w:spacing w:after="40"/>
-      </w:pPr>
-      <w:r>
-        <w:rPr>
-          <w:sz w:val="22"/>
-          <w:szCs w:val="22"/>
-        </w:rPr>
-        <w:t xml:space="preserve">Cliquez sur « Installer ».</w:t>
-      </w:r>
-    </w:p>
-    <w:p>
-      <w:pPr>
-        <w:spacing w:after="120"/>
-      </w:pPr>
-      <w:r>
-        <w:rPr>
-          <w:sz w:val="22"/>
-          <w:szCs w:val="22"/>
-        </w:rPr>
-        <w:t xml:space="preserve">Une fois installée, l'icône EduWeb apparaît sur votre écran d'accueil (ou votre bureau) et l'application se met à jour automatiquement à chaque connexion à Internet.</w:t>
-      </w:r>
-    </w:p>
-    <w:p>
-      <w:pPr>
-        <w:pBdr>
-          <w:top w:val="single" w:color="B8DCC6" w:sz="2" w:space="6"/>
-          <w:bottom w:val="single" w:color="B8DCC6" w:sz="2" w:space="6"/>
-          <w:left w:val="single" w:color="1E9E57" w:sz="18" w:space="10"/>
-          <w:right w:val="single" w:color="B8DCC6" w:sz="2" w:space="6"/>
-        </w:pBdr>
-        <w:shd w:fill="E8F5EC" w:val="clear"/>
-        <w:spacing w:after="140" w:before="80"/>
+          <w:sz w:val="36"/>
+          <w:szCs w:val="36"/>
+        </w:rPr>
+        <w:t xml:space="preserve">Sommaire</w:t>
+      </w:r>
+    </w:p>
+    <w:sdt>
+      <w:sdtPr>
+        <w:alias w:val="Sommaire"/>
+      </w:sdtPr>
+      <w:sdtContent>
+        <w:p>
+          <w:r>
+            <w:fldChar w:fldCharType="begin" w:dirty="true"/>
+            <w:instrText xml:space="preserve">TOC \h \o "1-1"</w:instrText>
+            <w:fldChar w:fldCharType="separate"/>
+          </w:r>
+        </w:p>
+        <w:p>
+          <w:r>
+            <w:fldChar w:fldCharType="end"/>
+          </w:r>
+        </w:p>
+      </w:sdtContent>
+    </w:sdt>
+    <w:p>
+      <w:r>
+        <w:br w:type="page"/>
+      </w:r>
+    </w:p>
+    <w:p>
+      <w:pPr>
+        <w:spacing w:after="80"/>
       </w:pPr>
       <w:r>
         <w:rPr>
           <w:b/>
           <w:bCs/>
-          <w:color w:val="0E6B3A"/>
+          <w:color w:val="1E9E57"/>
+          <w:spacing w:val="20"/>
+          <w:sz w:val="18"/>
+          <w:szCs w:val="18"/>
+        </w:rPr>
+        <w:t xml:space="preserve">À PROPOS DE CE GUIDE</w:t>
+      </w:r>
+    </w:p>
+    <w:p>
+      <w:pPr>
+        <w:pBdr>
+          <w:left w:val="single" w:color="1E9E57" w:sz="18" w:space="14"/>
+        </w:pBdr>
+        <w:spacing w:after="260"/>
+      </w:pPr>
+      <w:r>
+        <w:rPr>
+          <w:sz w:val="22"/>
+          <w:szCs w:val="22"/>
+        </w:rPr>
+        <w:t xml:space="preserve">L'administrateur pilote la plateforme selon les permissions accordées par le super-administrateur : Gestion des utilisateurs, Validation des coachs et/ou Finances. Ce guide décrit les tâches courantes, dont la recherche et la modification du profil d'un coach.</w:t>
+      </w:r>
+    </w:p>
+    <w:p>
+      <w:pPr>
+        <w:pStyle w:val="Heading1"/>
+      </w:pPr>
+      <w:r>
+        <w:t xml:space="preserve">1.  Connexion et tableau de bord</w:t>
+      </w:r>
+    </w:p>
+    <w:p>
+      <w:pPr>
+        <w:pStyle w:val="ListParagraph"/>
+        <w:numPr>
+          <w:ilvl w:val="0"/>
+          <w:numId w:val="2"/>
+        </w:numPr>
+        <w:spacing w:after="40"/>
+      </w:pPr>
+      <w:r>
+        <w:rPr>
+          <w:sz w:val="22"/>
+          <w:szCs w:val="22"/>
+        </w:rPr>
+        <w:t xml:space="preserve">Le tableau de bord présente des statistiques en temps réel et des cartes interactives.</w:t>
+      </w:r>
+    </w:p>
+    <w:p>
+      <w:pPr>
+        <w:pStyle w:val="ListParagraph"/>
+        <w:numPr>
+          <w:ilvl w:val="0"/>
+          <w:numId w:val="2"/>
+        </w:numPr>
+        <w:spacing w:after="40"/>
+      </w:pPr>
+      <w:r>
+        <w:rPr>
+          <w:sz w:val="22"/>
+          <w:szCs w:val="22"/>
+        </w:rPr>
+        <w:t xml:space="preserve">Trois permissions possibles : Gestion des utilisateurs, Validation des coachs, Finances &amp; statistiques. Vous ne voyez que les espaces correspondant à vos permissions.</w:t>
+      </w:r>
+    </w:p>
+    <w:p>
+      <w:pPr>
+        <w:pStyle w:val="Heading1"/>
+      </w:pPr>
+      <w:r>
+        <w:t xml:space="preserve">2.  Langue de lecture</w:t>
+      </w:r>
+    </w:p>
+    <w:p>
+      <w:pPr>
+        <w:spacing w:after="120"/>
+      </w:pPr>
+      <w:r>
+        <w:rPr>
+          <w:sz w:val="22"/>
+          <w:szCs w:val="22"/>
+        </w:rPr>
+        <w:t xml:space="preserve">L'application est disponible en 14 langues. Sur votre tableau de bord, la carte « Langue de lecture » permet de choisir la langue d'affichage ; votre choix est mémorisé pour vos prochaines visites.</w:t>
+      </w:r>
+    </w:p>
+    <w:p>
+      <w:pPr>
+        <w:pStyle w:val="ListParagraph"/>
+        <w:numPr>
+          <w:ilvl w:val="0"/>
+          <w:numId w:val="2"/>
+        </w:numPr>
+        <w:spacing w:after="40"/>
+      </w:pPr>
+      <w:r>
+        <w:rPr>
+          <w:sz w:val="22"/>
+          <w:szCs w:val="22"/>
+        </w:rPr>
+        <w:t xml:space="preserve">Français, Anglais, Arabe, Espagnol, Coréen, Mandarin (chinois), Russe, Ukrainien, Allemand, Portugais, Italien, Turc, Wolof, Swahili.</w:t>
+      </w:r>
+    </w:p>
+    <w:p>
+      <w:pPr>
+        <w:pStyle w:val="Heading1"/>
+      </w:pPr>
+      <w:r>
+        <w:t xml:space="preserve">3.  Besoin d'aide ?</w:t>
+      </w:r>
+    </w:p>
+    <w:p>
+      <w:pPr>
+        <w:spacing w:after="120"/>
+      </w:pPr>
+      <w:r>
+        <w:rPr>
+          <w:sz w:val="22"/>
+          <w:szCs w:val="22"/>
+        </w:rPr>
+        <w:t xml:space="preserve">Une carte « Besoin d'aide ? » figure sur votre tableau de bord, et un bouton flottant « Aide » (en bas à droite de l'écran) vous permet d'ouvrir ce guide à tout moment.</w:t>
+      </w:r>
+    </w:p>
+    <w:p>
+      <w:pPr>
+        <w:pStyle w:val="Heading1"/>
+      </w:pPr>
+      <w:r>
+        <w:t xml:space="preserve">4.  Installer l'application sur votre appareil</w:t>
+      </w:r>
+    </w:p>
+    <w:p>
+      <w:pPr>
+        <w:spacing w:after="120"/>
+      </w:pPr>
+      <w:r>
+        <w:rPr>
+          <w:sz w:val="22"/>
+          <w:szCs w:val="22"/>
+        </w:rPr>
+        <w:t xml:space="preserve">EduWeb est une application web installable : vous pouvez l'ajouter à l'écran d'accueil de votre téléphone ou au bureau de votre ordinateur, puis l'ouvrir comme une application classique — en plein écran, sans la barre du navigateur, avec l'icône EduWeb. L'installation est gratuite, rapide et ne passe par aucun magasin d'applications.</w:t>
+      </w:r>
+    </w:p>
+    <w:p>
+      <w:pPr>
+        <w:pStyle w:val="Heading2"/>
+      </w:pPr>
+      <w:r>
+        <w:t xml:space="preserve">Android (Chrome)</w:t>
+      </w:r>
+    </w:p>
+    <w:p>
+      <w:pPr>
+        <w:pStyle w:val="ListParagraph"/>
+        <w:numPr>
+          <w:ilvl w:val="0"/>
+          <w:numId w:val="3"/>
+        </w:numPr>
+        <w:spacing w:after="40"/>
+      </w:pPr>
+      <w:r>
+        <w:rPr>
+          <w:sz w:val="22"/>
+          <w:szCs w:val="22"/>
+        </w:rPr>
+        <w:t xml:space="preserve">Ouvrez family.eduweb.ci dans Chrome.</w:t>
+      </w:r>
+    </w:p>
+    <w:p>
+      <w:pPr>
+        <w:pStyle w:val="ListParagraph"/>
+        <w:numPr>
+          <w:ilvl w:val="0"/>
+          <w:numId w:val="3"/>
+        </w:numPr>
+        <w:spacing w:after="40"/>
+      </w:pPr>
+      <w:r>
+        <w:rPr>
+          <w:sz w:val="22"/>
+          <w:szCs w:val="22"/>
+        </w:rPr>
+        <w:t xml:space="preserve">Touchez la bannière « Installer l'application » si elle apparaît ; sinon, ouvrez le menu ⋮ (en haut à droite).</w:t>
+      </w:r>
+    </w:p>
+    <w:p>
+      <w:pPr>
+        <w:pStyle w:val="ListParagraph"/>
+        <w:numPr>
+          <w:ilvl w:val="0"/>
+          <w:numId w:val="3"/>
+        </w:numPr>
+        <w:spacing w:after="40"/>
+      </w:pPr>
+      <w:r>
+        <w:rPr>
+          <w:sz w:val="22"/>
+          <w:szCs w:val="22"/>
+        </w:rPr>
+        <w:t xml:space="preserve">Choisissez « Installer l'application » (ou « Ajouter à l'écran d'accueil »), puis confirmez.</w:t>
+      </w:r>
+    </w:p>
+    <w:p>
+      <w:pPr>
+        <w:pStyle w:val="Heading2"/>
+      </w:pPr>
+      <w:r>
+        <w:t xml:space="preserve">iPhone / iPad (Safari)</w:t>
+      </w:r>
+    </w:p>
+    <w:p>
+      <w:pPr>
+        <w:pStyle w:val="ListParagraph"/>
+        <w:numPr>
+          <w:ilvl w:val="0"/>
+          <w:numId w:val="4"/>
+        </w:numPr>
+        <w:spacing w:after="40"/>
+      </w:pPr>
+      <w:r>
+        <w:rPr>
+          <w:sz w:val="22"/>
+          <w:szCs w:val="22"/>
+        </w:rPr>
+        <w:t xml:space="preserve">Ouvrez family.eduweb.ci dans Safari.</w:t>
+      </w:r>
+    </w:p>
+    <w:p>
+      <w:pPr>
+        <w:pStyle w:val="ListParagraph"/>
+        <w:numPr>
+          <w:ilvl w:val="0"/>
+          <w:numId w:val="4"/>
+        </w:numPr>
+        <w:spacing w:after="40"/>
+      </w:pPr>
+      <w:r>
+        <w:rPr>
+          <w:sz w:val="22"/>
+          <w:szCs w:val="22"/>
+        </w:rPr>
+        <w:t xml:space="preserve">Touchez le bouton Partager (le carré surmonté d'une flèche vers le haut).</w:t>
+      </w:r>
+    </w:p>
+    <w:p>
+      <w:pPr>
+        <w:pStyle w:val="ListParagraph"/>
+        <w:numPr>
+          <w:ilvl w:val="0"/>
+          <w:numId w:val="4"/>
+        </w:numPr>
+        <w:spacing w:after="40"/>
+      </w:pPr>
+      <w:r>
+        <w:rPr>
+          <w:sz w:val="22"/>
+          <w:szCs w:val="22"/>
+        </w:rPr>
+        <w:t xml:space="preserve">Faites défiler, choisissez « Sur l'écran d'accueil », puis « Ajouter ».</w:t>
+      </w:r>
+    </w:p>
+    <w:p>
+      <w:pPr>
+        <w:pStyle w:val="Heading2"/>
+      </w:pPr>
+      <w:r>
+        <w:t xml:space="preserve">Ordinateur (Chrome ou Edge)</w:t>
+      </w:r>
+    </w:p>
+    <w:p>
+      <w:pPr>
+        <w:pStyle w:val="ListParagraph"/>
+        <w:numPr>
+          <w:ilvl w:val="0"/>
+          <w:numId w:val="5"/>
+        </w:numPr>
+        <w:spacing w:after="40"/>
+      </w:pPr>
+      <w:r>
+        <w:rPr>
+          <w:sz w:val="22"/>
+          <w:szCs w:val="22"/>
+        </w:rPr>
+        <w:t xml:space="preserve">Ouvrez family.eduweb.ci.</w:t>
+      </w:r>
+    </w:p>
+    <w:p>
+      <w:pPr>
+        <w:pStyle w:val="ListParagraph"/>
+        <w:numPr>
+          <w:ilvl w:val="0"/>
+          <w:numId w:val="5"/>
+        </w:numPr>
+        <w:spacing w:after="40"/>
+      </w:pPr>
+      <w:r>
+        <w:rPr>
+          <w:sz w:val="22"/>
+          <w:szCs w:val="22"/>
+        </w:rPr>
+        <w:t xml:space="preserve">Cliquez sur l'icône d'installation (un écran avec une flèche, ou ⊕) à droite de la barre d'adresse.</w:t>
+      </w:r>
+    </w:p>
+    <w:p>
+      <w:pPr>
+        <w:pStyle w:val="ListParagraph"/>
+        <w:numPr>
+          <w:ilvl w:val="0"/>
+          <w:numId w:val="5"/>
+        </w:numPr>
+        <w:spacing w:after="40"/>
+      </w:pPr>
+      <w:r>
+        <w:rPr>
+          <w:sz w:val="22"/>
+          <w:szCs w:val="22"/>
+        </w:rPr>
+        <w:t xml:space="preserve">Cliquez sur « Installer ».</w:t>
+      </w:r>
+    </w:p>
+    <w:p>
+      <w:pPr>
+        <w:spacing w:after="120"/>
+      </w:pPr>
+      <w:r>
+        <w:rPr>
+          <w:sz w:val="22"/>
+          <w:szCs w:val="22"/>
+        </w:rPr>
+        <w:t xml:space="preserve">Une fois installée, l'icône EduWeb apparaît sur votre écran d'accueil (ou votre bureau) et l'application se met à jour automatiquement à chaque connexion à Internet.</w:t>
+      </w:r>
+    </w:p>
+    <w:p>
+      <w:pPr>
+        <w:pBdr>
+          <w:top w:val="single" w:color="E8F5EC" w:sz="2" w:space="6"/>
+          <w:bottom w:val="single" w:color="E8F5EC" w:sz="2" w:space="6"/>
+          <w:left w:val="single" w:color="1E9E57" w:sz="18" w:space="10"/>
+          <w:right w:val="single" w:color="E8F5EC" w:sz="2" w:space="6"/>
+        </w:pBdr>
+        <w:shd w:fill="E8F5EC" w:color="auto" w:val="clear"/>
+        <w:spacing w:after="140" w:before="80"/>
+      </w:pPr>
+      <w:r>
+        <w:rPr>
+          <w:b/>
+          <w:bCs/>
+          <w:color w:val="1E9E57"/>
           <w:sz w:val="21"/>
           <w:szCs w:val="21"/>
         </w:rPr>
@@ -450,7 +533,7 @@
         <w:pStyle w:val="Heading1"/>
       </w:pPr>
       <w:r>
-        <w:t xml:space="preserve">2. Gestion des utilisateurs</w:t>
+        <w:t xml:space="preserve">5.  Gestion des utilisateurs</w:t>
       </w:r>
     </w:p>
     <w:p>
@@ -524,7 +607,7 @@
         <w:pStyle w:val="Heading1"/>
       </w:pPr>
       <w:r>
-        <w:t xml:space="preserve">3. Coachs : rechercher, consulter, modifier</w:t>
+        <w:t xml:space="preserve">6.  Coachs : rechercher, consulter, modifier</w:t>
       </w:r>
     </w:p>
     <w:p>
@@ -655,19 +738,19 @@
     <w:p>
       <w:pPr>
         <w:pBdr>
-          <w:top w:val="single" w:color="B8DCC6" w:sz="2" w:space="6"/>
-          <w:bottom w:val="single" w:color="B8DCC6" w:sz="2" w:space="6"/>
+          <w:top w:val="single" w:color="E8F5EC" w:sz="2" w:space="6"/>
+          <w:bottom w:val="single" w:color="E8F5EC" w:sz="2" w:space="6"/>
           <w:left w:val="single" w:color="1E9E57" w:sz="18" w:space="10"/>
-          <w:right w:val="single" w:color="B8DCC6" w:sz="2" w:space="6"/>
+          <w:right w:val="single" w:color="E8F5EC" w:sz="2" w:space="6"/>
         </w:pBdr>
-        <w:shd w:fill="E8F5EC" w:val="clear"/>
+        <w:shd w:fill="E8F5EC" w:color="auto" w:val="clear"/>
         <w:spacing w:after="140" w:before="80"/>
       </w:pPr>
       <w:r>
         <w:rPr>
           <w:b/>
           <w:bCs/>
-          <w:color w:val="0E6B3A"/>
+          <w:color w:val="1E9E57"/>
           <w:sz w:val="21"/>
           <w:szCs w:val="21"/>
         </w:rPr>
@@ -687,7 +770,7 @@
         <w:pStyle w:val="Heading1"/>
       </w:pPr>
       <w:r>
-        <w:t xml:space="preserve">4. Finances &amp; commissions</w:t>
+        <w:t xml:space="preserve">7.  Finances &amp; commissions</w:t>
       </w:r>
     </w:p>
     <w:p>
@@ -741,7 +824,7 @@
         <w:pStyle w:val="Heading1"/>
       </w:pPr>
       <w:r>
-        <w:t xml:space="preserve">5. Messagerie</w:t>
+        <w:t xml:space="preserve">8.  Messagerie</w:t>
       </w:r>
     </w:p>
     <w:p>
@@ -761,7 +844,7 @@
         <w:pStyle w:val="Heading1"/>
       </w:pPr>
       <w:r>
-        <w:t xml:space="preserve">6. Votre compte</w:t>
+        <w:t xml:space="preserve">9.  Votre compte</w:t>
       </w:r>
     </w:p>
     <w:p>
@@ -778,7 +861,7 @@
     </w:p>
     <w:sectPr>
       <w:footerReference w:type="default" r:id="rId7"/>
-      <w:pgSz w:w="12240" w:h="15840" w:orient="portrait"/>
+      <w:pgSz w:w="11906" w:h="16838" w:orient="portrait"/>
       <w:pgMar w:top="1440" w:right="1440" w:bottom="1440" w:left="1440" w:header="708" w:footer="708" w:gutter="0"/>
       <w:pgNumType/>
       <w:docGrid w:linePitch="360"/>
@@ -836,7 +919,7 @@
         <w:top w:val="single" w:color="DDDDDD" w:sz="4" w:space="6"/>
       </w:pBdr>
       <w:tabs>
-        <w:tab w:val="right" w:pos="9360"/>
+        <w:tab w:val="right" w:pos="9026"/>
       </w:tabs>
     </w:pPr>
     <w:r>
@@ -1282,7 +1365,10 @@
     <w:next w:val="Normal"/>
     <w:qFormat/>
     <w:pPr>
-      <w:spacing w:after="140" w:before="280"/>
+      <w:pBdr>
+        <w:bottom w:val="single" w:color="1E9E57" w:sz="8" w:space="4"/>
+      </w:pBdr>
+      <w:spacing w:after="160" w:before="340"/>
       <w:outlineLvl w:val="0"/>
     </w:pPr>
     <w:rPr>

</xml_diff>

<commit_message>
docs(guides): version pedagogique pour grands debutants du numerique
Ajoute a chaque guide un chapitre d'accueil « Bien demarrer — a lire en
premier » : rassurance, vocabulaire de base (navigateur, compte, e-mail,
mot de passe, bouton, lien, formulaire), gestes de base (toucher, faire
defiler, revenir en arriere) et ouverture pas-a-pas du site.

- Installation : precise qu'elle est facultative.
- Creation de compte (Parent) : etapes plus explicites + rappels e-mail
  (verifier l'adresse, dossier spam) et « Mot de passe oublie ? ».

Regeneration des 5 guides (PDF + Word).

Co-Authored-By: Claude Opus 4.8 (1M context) <noreply@anthropic.com>
</commit_message>
<xml_diff>
--- a/guides/Guide-Admin-EduWeb.docx
+++ b/guides/Guide-Admin-EduWeb.docx
@@ -109,7 +109,7 @@
           <w:sz w:val="16"/>
           <w:szCs w:val="16"/>
         </w:rPr>
-        <w:t xml:space="preserve">family.eduweb.ci · Version du 20 juin 2026</w:t>
+        <w:t xml:space="preserve">family.eduweb.ci · Version du 19 juillet 2026</w:t>
       </w:r>
     </w:p>
     <w:p>
@@ -195,49 +195,7 @@
         <w:pStyle w:val="Heading1"/>
       </w:pPr>
       <w:r>
-        <w:t xml:space="preserve">1.  Connexion et tableau de bord</w:t>
-      </w:r>
-    </w:p>
-    <w:p>
-      <w:pPr>
-        <w:pStyle w:val="ListParagraph"/>
-        <w:numPr>
-          <w:ilvl w:val="0"/>
-          <w:numId w:val="2"/>
-        </w:numPr>
-        <w:spacing w:after="40"/>
-      </w:pPr>
-      <w:r>
-        <w:rPr>
-          <w:sz w:val="22"/>
-          <w:szCs w:val="22"/>
-        </w:rPr>
-        <w:t xml:space="preserve">Le tableau de bord présente des statistiques en temps réel et des cartes interactives.</w:t>
-      </w:r>
-    </w:p>
-    <w:p>
-      <w:pPr>
-        <w:pStyle w:val="ListParagraph"/>
-        <w:numPr>
-          <w:ilvl w:val="0"/>
-          <w:numId w:val="2"/>
-        </w:numPr>
-        <w:spacing w:after="40"/>
-      </w:pPr>
-      <w:r>
-        <w:rPr>
-          <w:sz w:val="22"/>
-          <w:szCs w:val="22"/>
-        </w:rPr>
-        <w:t xml:space="preserve">Trois permissions possibles : Gestion des utilisateurs, Validation des coachs, Finances &amp; statistiques. Vous ne voyez que les espaces correspondant à vos permissions.</w:t>
-      </w:r>
-    </w:p>
-    <w:p>
-      <w:pPr>
-        <w:pStyle w:val="Heading1"/>
-      </w:pPr>
-      <w:r>
-        <w:t xml:space="preserve">2.  Langue de lecture</w:t>
+        <w:t xml:space="preserve">1.  Bien démarrer — à lire en premier</w:t>
       </w:r>
     </w:p>
     <w:p>
@@ -249,64 +207,37 @@
           <w:sz w:val="22"/>
           <w:szCs w:val="22"/>
         </w:rPr>
-        <w:t xml:space="preserve">L'application est disponible en 14 langues. Sur votre tableau de bord, la carte « Langue de lecture » permet de choisir la langue d'affichage ; votre choix est mémorisé pour vos prochaines visites.</w:t>
-      </w:r>
-    </w:p>
-    <w:p>
-      <w:pPr>
-        <w:pStyle w:val="ListParagraph"/>
-        <w:numPr>
-          <w:ilvl w:val="0"/>
-          <w:numId w:val="2"/>
-        </w:numPr>
-        <w:spacing w:after="40"/>
-      </w:pPr>
-      <w:r>
-        <w:rPr>
-          <w:sz w:val="22"/>
-          <w:szCs w:val="22"/>
-        </w:rPr>
-        <w:t xml:space="preserve">Français, Anglais, Arabe, Espagnol, Coréen, Mandarin (chinois), Russe, Ukrainien, Allemand, Portugais, Italien, Turc, Wolof, Swahili.</w:t>
-      </w:r>
-    </w:p>
-    <w:p>
-      <w:pPr>
-        <w:pStyle w:val="Heading1"/>
-      </w:pPr>
-      <w:r>
-        <w:t xml:space="preserve">3.  Besoin d'aide ?</w:t>
-      </w:r>
-    </w:p>
-    <w:p>
-      <w:pPr>
-        <w:spacing w:after="120"/>
-      </w:pPr>
-      <w:r>
-        <w:rPr>
-          <w:sz w:val="22"/>
-          <w:szCs w:val="22"/>
-        </w:rPr>
-        <w:t xml:space="preserve">Une carte « Besoin d'aide ? » figure sur votre tableau de bord, et un bouton flottant « Aide » (en bas à droite de l'écran) vous permet d'ouvrir ce guide à tout moment.</w:t>
-      </w:r>
-    </w:p>
-    <w:p>
-      <w:pPr>
-        <w:pStyle w:val="Heading1"/>
-      </w:pPr>
-      <w:r>
-        <w:t xml:space="preserve">4.  Installer l'application sur votre appareil</w:t>
-      </w:r>
-    </w:p>
-    <w:p>
-      <w:pPr>
-        <w:spacing w:after="120"/>
-      </w:pPr>
-      <w:r>
-        <w:rPr>
-          <w:sz w:val="22"/>
-          <w:szCs w:val="22"/>
-        </w:rPr>
-        <w:t xml:space="preserve">EduWeb est une application web installable : vous pouvez l'ajouter à l'écran d'accueil de votre téléphone ou au bureau de votre ordinateur, puis l'ouvrir comme une application classique — en plein écran, sans la barre du navigateur, avec l'icône EduWeb. L'installation est gratuite, rapide et ne passe par aucun magasin d'applications.</w:t>
+        <w:t xml:space="preserve">Ce guide est fait pour tout le monde, même si vous n'avez pas l'habitude des téléphones ou des ordinateurs. Avancez à votre rythme : vous ne pouvez rien « casser », et il est toujours possible de revenir en arrière.</w:t>
+      </w:r>
+    </w:p>
+    <w:p>
+      <w:pPr>
+        <w:pBdr>
+          <w:top w:val="single" w:color="EAF3FB" w:sz="2" w:space="6"/>
+          <w:bottom w:val="single" w:color="EAF3FB" w:sz="2" w:space="6"/>
+          <w:left w:val="single" w:color="2A77C6" w:sz="18" w:space="10"/>
+          <w:right w:val="single" w:color="EAF3FB" w:sz="2" w:space="6"/>
+        </w:pBdr>
+        <w:shd w:fill="EAF3FB" w:color="auto" w:val="clear"/>
+        <w:spacing w:after="140" w:before="80"/>
+      </w:pPr>
+      <w:r>
+        <w:rPr>
+          <w:b/>
+          <w:bCs/>
+          <w:color w:val="2A77C6"/>
+          <w:sz w:val="21"/>
+          <w:szCs w:val="21"/>
+        </w:rPr>
+        <w:t xml:space="preserve">Astuce — </w:t>
+      </w:r>
+      <w:r>
+        <w:rPr>
+          <w:color w:val="1B3A57"/>
+          <w:sz w:val="21"/>
+          <w:szCs w:val="21"/>
+        </w:rPr>
+        <w:t xml:space="preserve">Pour utiliser EduWeb, il vous faut seulement deux choses : un appareil connecté à Internet (téléphone Android, iPhone ou ordinateur) et une adresse e-mail. Si vous n'en avez pas, faites-vous aider pour créer une adresse gratuite (par exemple une adresse Gmail).</w:t>
       </w:r>
     </w:p>
     <w:p>
@@ -314,7 +245,227 @@
         <w:pStyle w:val="Heading2"/>
       </w:pPr>
       <w:r>
-        <w:t xml:space="preserve">Android (Chrome)</w:t>
+        <w:t xml:space="preserve">Quelques mots à connaître</w:t>
+      </w:r>
+    </w:p>
+    <w:p>
+      <w:pPr>
+        <w:pStyle w:val="ListParagraph"/>
+        <w:numPr>
+          <w:ilvl w:val="0"/>
+          <w:numId w:val="2"/>
+        </w:numPr>
+        <w:spacing w:after="40"/>
+      </w:pPr>
+      <w:r>
+        <w:rPr>
+          <w:sz w:val="22"/>
+          <w:szCs w:val="22"/>
+        </w:rPr>
+        <w:t xml:space="preserve">Navigateur : le programme qui sert à ouvrir les sites Internet. Sur Android, c'est souvent « Chrome » ; sur iPhone, « Safari ».</w:t>
+      </w:r>
+    </w:p>
+    <w:p>
+      <w:pPr>
+        <w:pStyle w:val="ListParagraph"/>
+        <w:numPr>
+          <w:ilvl w:val="0"/>
+          <w:numId w:val="2"/>
+        </w:numPr>
+        <w:spacing w:after="40"/>
+      </w:pPr>
+      <w:r>
+        <w:rPr>
+          <w:sz w:val="22"/>
+          <w:szCs w:val="22"/>
+        </w:rPr>
+        <w:t xml:space="preserve">Adresse du site : ce que l'on écrit tout en haut de l'écran pour ouvrir EduWeb. La nôtre est : family.eduweb.ci</w:t>
+      </w:r>
+    </w:p>
+    <w:p>
+      <w:pPr>
+        <w:pStyle w:val="ListParagraph"/>
+        <w:numPr>
+          <w:ilvl w:val="0"/>
+          <w:numId w:val="2"/>
+        </w:numPr>
+        <w:spacing w:after="40"/>
+      </w:pPr>
+      <w:r>
+        <w:rPr>
+          <w:sz w:val="22"/>
+          <w:szCs w:val="22"/>
+        </w:rPr>
+        <w:t xml:space="preserve">Compte : votre espace personnel, protégé par votre e-mail et un mot de passe.</w:t>
+      </w:r>
+    </w:p>
+    <w:p>
+      <w:pPr>
+        <w:pStyle w:val="ListParagraph"/>
+        <w:numPr>
+          <w:ilvl w:val="0"/>
+          <w:numId w:val="2"/>
+        </w:numPr>
+        <w:spacing w:after="40"/>
+      </w:pPr>
+      <w:r>
+        <w:rPr>
+          <w:sz w:val="22"/>
+          <w:szCs w:val="22"/>
+        </w:rPr>
+        <w:t xml:space="preserve">E-mail (ou courriel) : votre adresse électronique, du type nom@exemple.com. Elle sert à créer votre compte et à recevoir les messages importants.</w:t>
+      </w:r>
+    </w:p>
+    <w:p>
+      <w:pPr>
+        <w:pStyle w:val="ListParagraph"/>
+        <w:numPr>
+          <w:ilvl w:val="0"/>
+          <w:numId w:val="2"/>
+        </w:numPr>
+        <w:spacing w:after="40"/>
+      </w:pPr>
+      <w:r>
+        <w:rPr>
+          <w:sz w:val="22"/>
+          <w:szCs w:val="22"/>
+        </w:rPr>
+        <w:t xml:space="preserve">Mot de passe : un code secret que vous choisissez (au moins 6 caractères). Ne le communiquez à personne.</w:t>
+      </w:r>
+    </w:p>
+    <w:p>
+      <w:pPr>
+        <w:pStyle w:val="ListParagraph"/>
+        <w:numPr>
+          <w:ilvl w:val="0"/>
+          <w:numId w:val="2"/>
+        </w:numPr>
+        <w:spacing w:after="40"/>
+      </w:pPr>
+      <w:r>
+        <w:rPr>
+          <w:sz w:val="22"/>
+          <w:szCs w:val="22"/>
+        </w:rPr>
+        <w:t xml:space="preserve">Bouton : une zone colorée sur laquelle on appuie pour agir (par exemple « Créer un compte »).</w:t>
+      </w:r>
+    </w:p>
+    <w:p>
+      <w:pPr>
+        <w:pStyle w:val="ListParagraph"/>
+        <w:numPr>
+          <w:ilvl w:val="0"/>
+          <w:numId w:val="2"/>
+        </w:numPr>
+        <w:spacing w:after="40"/>
+      </w:pPr>
+      <w:r>
+        <w:rPr>
+          <w:sz w:val="22"/>
+          <w:szCs w:val="22"/>
+        </w:rPr>
+        <w:t xml:space="preserve">Lien : un mot souligné ou coloré sur lequel on appuie pour aller à une autre page.</w:t>
+      </w:r>
+    </w:p>
+    <w:p>
+      <w:pPr>
+        <w:pStyle w:val="ListParagraph"/>
+        <w:numPr>
+          <w:ilvl w:val="0"/>
+          <w:numId w:val="2"/>
+        </w:numPr>
+        <w:spacing w:after="40"/>
+      </w:pPr>
+      <w:r>
+        <w:rPr>
+          <w:sz w:val="22"/>
+          <w:szCs w:val="22"/>
+        </w:rPr>
+        <w:t xml:space="preserve">Formulaire : une suite de cases à remplir (nom, e-mail, etc.).</w:t>
+      </w:r>
+    </w:p>
+    <w:p>
+      <w:pPr>
+        <w:pStyle w:val="Heading2"/>
+      </w:pPr>
+      <w:r>
+        <w:t xml:space="preserve">Les gestes de base</w:t>
+      </w:r>
+    </w:p>
+    <w:p>
+      <w:pPr>
+        <w:pStyle w:val="ListParagraph"/>
+        <w:numPr>
+          <w:ilvl w:val="0"/>
+          <w:numId w:val="2"/>
+        </w:numPr>
+        <w:spacing w:after="40"/>
+      </w:pPr>
+      <w:r>
+        <w:rPr>
+          <w:sz w:val="22"/>
+          <w:szCs w:val="22"/>
+        </w:rPr>
+        <w:t xml:space="preserve">Toucher ou cliquer : appuyer une fois sur un bouton ou un lien — avec le doigt sur un téléphone, avec la souris sur un ordinateur.</w:t>
+      </w:r>
+    </w:p>
+    <w:p>
+      <w:pPr>
+        <w:pStyle w:val="ListParagraph"/>
+        <w:numPr>
+          <w:ilvl w:val="0"/>
+          <w:numId w:val="2"/>
+        </w:numPr>
+        <w:spacing w:after="40"/>
+      </w:pPr>
+      <w:r>
+        <w:rPr>
+          <w:sz w:val="22"/>
+          <w:szCs w:val="22"/>
+        </w:rPr>
+        <w:t xml:space="preserve">Faire défiler : glisser le doigt vers le haut ou vers le bas pour voir la suite de la page.</w:t>
+      </w:r>
+    </w:p>
+    <w:p>
+      <w:pPr>
+        <w:pStyle w:val="ListParagraph"/>
+        <w:numPr>
+          <w:ilvl w:val="0"/>
+          <w:numId w:val="2"/>
+        </w:numPr>
+        <w:spacing w:after="40"/>
+      </w:pPr>
+      <w:r>
+        <w:rPr>
+          <w:sz w:val="22"/>
+          <w:szCs w:val="22"/>
+        </w:rPr>
+        <w:t xml:space="preserve">Écrire : touchez une case ; un clavier apparaît (sur téléphone) pour taper votre texte.</w:t>
+      </w:r>
+    </w:p>
+    <w:p>
+      <w:pPr>
+        <w:pStyle w:val="ListParagraph"/>
+        <w:numPr>
+          <w:ilvl w:val="0"/>
+          <w:numId w:val="2"/>
+        </w:numPr>
+        <w:spacing w:after="40"/>
+      </w:pPr>
+      <w:r>
+        <w:rPr>
+          <w:sz w:val="22"/>
+          <w:szCs w:val="22"/>
+        </w:rPr>
+        <w:t xml:space="preserve">Revenir en arrière : la flèche « ← », en haut de l'écran, ramène à la page précédente.</w:t>
+      </w:r>
+    </w:p>
+    <w:p>
+      <w:pPr>
+        <w:pStyle w:val="Heading2"/>
+      </w:pPr>
+      <w:r>
+        <w:t xml:space="preserve">Ouvrir EduWeb (la première fois)</w:t>
       </w:r>
     </w:p>
     <w:p>
@@ -331,7 +482,7 @@
           <w:sz w:val="22"/>
           <w:szCs w:val="22"/>
         </w:rPr>
-        <w:t xml:space="preserve">Ouvrez family.eduweb.ci dans Chrome.</w:t>
+        <w:t xml:space="preserve">Ouvrez votre navigateur : l'icône « Chrome » (Android) ou « Safari » (iPhone).</w:t>
       </w:r>
     </w:p>
     <w:p>
@@ -348,7 +499,7 @@
           <w:sz w:val="22"/>
           <w:szCs w:val="22"/>
         </w:rPr>
-        <w:t xml:space="preserve">Touchez la bannière « Installer l'application » si elle apparaît ; sinon, ouvrez le menu ⋮ (en haut à droite).</w:t>
+        <w:t xml:space="preserve">Tout en haut de l'écran, écrivez l'adresse : family.eduweb.ci</w:t>
       </w:r>
     </w:p>
     <w:p>
@@ -365,137 +516,54 @@
           <w:sz w:val="22"/>
           <w:szCs w:val="22"/>
         </w:rPr>
-        <w:t xml:space="preserve">Choisissez « Installer l'application » (ou « Ajouter à l'écran d'accueil »), puis confirmez.</w:t>
-      </w:r>
-    </w:p>
-    <w:p>
-      <w:pPr>
-        <w:pStyle w:val="Heading2"/>
-      </w:pPr>
-      <w:r>
-        <w:t xml:space="preserve">iPhone / iPad (Safari)</w:t>
-      </w:r>
-    </w:p>
-    <w:p>
-      <w:pPr>
-        <w:pStyle w:val="ListParagraph"/>
-        <w:numPr>
-          <w:ilvl w:val="0"/>
-          <w:numId w:val="4"/>
-        </w:numPr>
-        <w:spacing w:after="40"/>
-      </w:pPr>
-      <w:r>
-        <w:rPr>
-          <w:sz w:val="22"/>
-          <w:szCs w:val="22"/>
-        </w:rPr>
-        <w:t xml:space="preserve">Ouvrez family.eduweb.ci dans Safari.</w:t>
-      </w:r>
-    </w:p>
-    <w:p>
-      <w:pPr>
-        <w:pStyle w:val="ListParagraph"/>
-        <w:numPr>
-          <w:ilvl w:val="0"/>
-          <w:numId w:val="4"/>
-        </w:numPr>
-        <w:spacing w:after="40"/>
-      </w:pPr>
-      <w:r>
-        <w:rPr>
-          <w:sz w:val="22"/>
-          <w:szCs w:val="22"/>
-        </w:rPr>
-        <w:t xml:space="preserve">Touchez le bouton Partager (le carré surmonté d'une flèche vers le haut).</w:t>
-      </w:r>
-    </w:p>
-    <w:p>
-      <w:pPr>
-        <w:pStyle w:val="ListParagraph"/>
-        <w:numPr>
-          <w:ilvl w:val="0"/>
-          <w:numId w:val="4"/>
-        </w:numPr>
-        <w:spacing w:after="40"/>
-      </w:pPr>
-      <w:r>
-        <w:rPr>
-          <w:sz w:val="22"/>
-          <w:szCs w:val="22"/>
-        </w:rPr>
-        <w:t xml:space="preserve">Faites défiler, choisissez « Sur l'écran d'accueil », puis « Ajouter ».</w:t>
-      </w:r>
-    </w:p>
-    <w:p>
-      <w:pPr>
-        <w:pStyle w:val="Heading2"/>
-      </w:pPr>
-      <w:r>
-        <w:t xml:space="preserve">Ordinateur (Chrome ou Edge)</w:t>
-      </w:r>
-    </w:p>
-    <w:p>
-      <w:pPr>
-        <w:pStyle w:val="ListParagraph"/>
-        <w:numPr>
-          <w:ilvl w:val="0"/>
-          <w:numId w:val="5"/>
-        </w:numPr>
-        <w:spacing w:after="40"/>
-      </w:pPr>
-      <w:r>
-        <w:rPr>
-          <w:sz w:val="22"/>
-          <w:szCs w:val="22"/>
-        </w:rPr>
-        <w:t xml:space="preserve">Ouvrez family.eduweb.ci.</w:t>
-      </w:r>
-    </w:p>
-    <w:p>
-      <w:pPr>
-        <w:pStyle w:val="ListParagraph"/>
-        <w:numPr>
-          <w:ilvl w:val="0"/>
-          <w:numId w:val="5"/>
-        </w:numPr>
-        <w:spacing w:after="40"/>
-      </w:pPr>
-      <w:r>
-        <w:rPr>
-          <w:sz w:val="22"/>
-          <w:szCs w:val="22"/>
-        </w:rPr>
-        <w:t xml:space="preserve">Cliquez sur l'icône d'installation (un écran avec une flèche, ou ⊕) à droite de la barre d'adresse.</w:t>
-      </w:r>
-    </w:p>
-    <w:p>
-      <w:pPr>
-        <w:pStyle w:val="ListParagraph"/>
-        <w:numPr>
-          <w:ilvl w:val="0"/>
-          <w:numId w:val="5"/>
-        </w:numPr>
-        <w:spacing w:after="40"/>
-      </w:pPr>
-      <w:r>
-        <w:rPr>
-          <w:sz w:val="22"/>
-          <w:szCs w:val="22"/>
-        </w:rPr>
-        <w:t xml:space="preserve">Cliquez sur « Installer ».</w:t>
-      </w:r>
-    </w:p>
-    <w:p>
-      <w:pPr>
-        <w:spacing w:after="120"/>
-      </w:pPr>
-      <w:r>
-        <w:rPr>
-          <w:sz w:val="22"/>
-          <w:szCs w:val="22"/>
-        </w:rPr>
-        <w:t xml:space="preserve">Une fois installée, l'icône EduWeb apparaît sur votre écran d'accueil (ou votre bureau) et l'application se met à jour automatiquement à chaque connexion à Internet.</w:t>
+        <w:t xml:space="preserve">Validez avec la touche « Entrée » ou « Aller » du clavier.</w:t>
+      </w:r>
+    </w:p>
+    <w:p>
+      <w:pPr>
+        <w:pStyle w:val="ListParagraph"/>
+        <w:numPr>
+          <w:ilvl w:val="0"/>
+          <w:numId w:val="3"/>
+        </w:numPr>
+        <w:spacing w:after="40"/>
+      </w:pPr>
+      <w:r>
+        <w:rPr>
+          <w:sz w:val="22"/>
+          <w:szCs w:val="22"/>
+        </w:rPr>
+        <w:t xml:space="preserve">La page d'accueil d'EduWeb s'affiche : vous êtes au bon endroit.</w:t>
+      </w:r>
+    </w:p>
+    <w:p>
+      <w:pPr>
+        <w:pBdr>
+          <w:top w:val="single" w:color="FDF3E6" w:sz="2" w:space="6"/>
+          <w:bottom w:val="single" w:color="FDF3E6" w:sz="2" w:space="6"/>
+          <w:left w:val="single" w:color="C9871C" w:sz="18" w:space="10"/>
+          <w:right w:val="single" w:color="FDF3E6" w:sz="2" w:space="6"/>
+        </w:pBdr>
+        <w:shd w:fill="FDF3E6" w:color="auto" w:val="clear"/>
+        <w:spacing w:after="140" w:before="80"/>
+      </w:pPr>
+      <w:r>
+        <w:rPr>
+          <w:b/>
+          <w:bCs/>
+          <w:color w:val="C9871C"/>
+          <w:sz w:val="21"/>
+          <w:szCs w:val="21"/>
+        </w:rPr>
+        <w:t xml:space="preserve">Attention — </w:t>
+      </w:r>
+      <w:r>
+        <w:rPr>
+          <w:color w:val="5A3D12"/>
+          <w:sz w:val="21"/>
+          <w:szCs w:val="21"/>
+        </w:rPr>
+        <w:t xml:space="preserve">Vérifiez bien l'adresse — family.eduweb.ci — sans espace. N'ouvrez jamais un lien reçu d'un inconnu qui imiterait le site, et ne donnez votre mot de passe à personne.</w:t>
       </w:r>
     </w:p>
     <w:p>
@@ -525,7 +593,7 @@
           <w:sz w:val="21"/>
           <w:szCs w:val="21"/>
         </w:rPr>
-        <w:t xml:space="preserve">En cas de coupure d'Internet, l'application affiche une page d'attente claire et se recharge automatiquement dès le retour de la connexion. La consultation des pages nécessite une connexion active.</w:t>
+        <w:t xml:space="preserve">Vous êtes perdu à un moment ? Deux réflexes simples : appuyez sur la flèche « ← » pour revenir en arrière, ou utilisez le bouton « Aide » (en bas à droite de l'écran), qui rouvre ce guide.</w:t>
       </w:r>
     </w:p>
     <w:p>
@@ -533,7 +601,49 @@
         <w:pStyle w:val="Heading1"/>
       </w:pPr>
       <w:r>
-        <w:t xml:space="preserve">5.  Gestion des utilisateurs</w:t>
+        <w:t xml:space="preserve">2.  Connexion et tableau de bord</w:t>
+      </w:r>
+    </w:p>
+    <w:p>
+      <w:pPr>
+        <w:pStyle w:val="ListParagraph"/>
+        <w:numPr>
+          <w:ilvl w:val="0"/>
+          <w:numId w:val="2"/>
+        </w:numPr>
+        <w:spacing w:after="40"/>
+      </w:pPr>
+      <w:r>
+        <w:rPr>
+          <w:sz w:val="22"/>
+          <w:szCs w:val="22"/>
+        </w:rPr>
+        <w:t xml:space="preserve">Le tableau de bord présente des statistiques en temps réel et des cartes interactives.</w:t>
+      </w:r>
+    </w:p>
+    <w:p>
+      <w:pPr>
+        <w:pStyle w:val="ListParagraph"/>
+        <w:numPr>
+          <w:ilvl w:val="0"/>
+          <w:numId w:val="2"/>
+        </w:numPr>
+        <w:spacing w:after="40"/>
+      </w:pPr>
+      <w:r>
+        <w:rPr>
+          <w:sz w:val="22"/>
+          <w:szCs w:val="22"/>
+        </w:rPr>
+        <w:t xml:space="preserve">Trois permissions possibles : Gestion des utilisateurs, Validation des coachs, Finances &amp; statistiques. Vous ne voyez que les espaces correspondant à vos permissions.</w:t>
+      </w:r>
+    </w:p>
+    <w:p>
+      <w:pPr>
+        <w:pStyle w:val="Heading1"/>
+      </w:pPr>
+      <w:r>
+        <w:t xml:space="preserve">3.  Langue de lecture</w:t>
       </w:r>
     </w:p>
     <w:p>
@@ -545,41 +655,94 @@
           <w:sz w:val="22"/>
           <w:szCs w:val="22"/>
         </w:rPr>
-        <w:t xml:space="preserve">Permission requise : « Gestion des utilisateurs ».</w:t>
-      </w:r>
-    </w:p>
-    <w:p>
-      <w:pPr>
-        <w:pStyle w:val="ListParagraph"/>
-        <w:numPr>
-          <w:ilvl w:val="0"/>
-          <w:numId w:val="2"/>
-        </w:numPr>
-        <w:spacing w:after="40"/>
-      </w:pPr>
-      <w:r>
-        <w:rPr>
-          <w:sz w:val="22"/>
-          <w:szCs w:val="22"/>
-        </w:rPr>
-        <w:t xml:space="preserve">Liste filtrable (parents, coachs, admins) avec recherche par nom ou email.</w:t>
-      </w:r>
-    </w:p>
-    <w:p>
-      <w:pPr>
-        <w:pStyle w:val="ListParagraph"/>
-        <w:numPr>
-          <w:ilvl w:val="0"/>
-          <w:numId w:val="2"/>
-        </w:numPr>
-        <w:spacing w:after="40"/>
-      </w:pPr>
-      <w:r>
-        <w:rPr>
-          <w:sz w:val="22"/>
-          <w:szCs w:val="22"/>
-        </w:rPr>
-        <w:t xml:space="preserve">Créer un utilisateur (activé immédiatement), changer son rôle, le suspendre/réactiver, ou le supprimer (avec ses données liées).</w:t>
+        <w:t xml:space="preserve">L'application est disponible en 14 langues. Sur votre tableau de bord, la carte « Langue de lecture » permet de choisir la langue d'affichage ; votre choix est mémorisé pour vos prochaines visites.</w:t>
+      </w:r>
+    </w:p>
+    <w:p>
+      <w:pPr>
+        <w:pStyle w:val="ListParagraph"/>
+        <w:numPr>
+          <w:ilvl w:val="0"/>
+          <w:numId w:val="2"/>
+        </w:numPr>
+        <w:spacing w:after="40"/>
+      </w:pPr>
+      <w:r>
+        <w:rPr>
+          <w:sz w:val="22"/>
+          <w:szCs w:val="22"/>
+        </w:rPr>
+        <w:t xml:space="preserve">Français, Anglais, Arabe, Espagnol, Coréen, Mandarin (chinois), Russe, Ukrainien, Allemand, Portugais, Italien, Turc, Wolof, Swahili.</w:t>
+      </w:r>
+    </w:p>
+    <w:p>
+      <w:pPr>
+        <w:pStyle w:val="Heading1"/>
+      </w:pPr>
+      <w:r>
+        <w:t xml:space="preserve">4.  Besoin d'aide ?</w:t>
+      </w:r>
+    </w:p>
+    <w:p>
+      <w:pPr>
+        <w:spacing w:after="120"/>
+      </w:pPr>
+      <w:r>
+        <w:rPr>
+          <w:sz w:val="22"/>
+          <w:szCs w:val="22"/>
+        </w:rPr>
+        <w:t xml:space="preserve">Une carte « Besoin d'aide ? » figure sur votre tableau de bord, et un bouton flottant « Aide » (en bas à droite de l'écran) vous permet d'ouvrir ce guide à tout moment.</w:t>
+      </w:r>
+    </w:p>
+    <w:p>
+      <w:pPr>
+        <w:pStyle w:val="Heading1"/>
+      </w:pPr>
+      <w:r>
+        <w:t xml:space="preserve">5.  Installer l'application sur votre appareil</w:t>
+      </w:r>
+    </w:p>
+    <w:p>
+      <w:pPr>
+        <w:spacing w:after="120"/>
+      </w:pPr>
+      <w:r>
+        <w:rPr>
+          <w:sz w:val="22"/>
+          <w:szCs w:val="22"/>
+        </w:rPr>
+        <w:t xml:space="preserve">EduWeb est une application web installable : vous pouvez l'ajouter à l'écran d'accueil de votre téléphone ou au bureau de votre ordinateur, puis l'ouvrir comme une application classique — en plein écran, sans la barre du navigateur, avec l'icône EduWeb. L'installation est gratuite, rapide et ne passe par aucun magasin d'applications.</w:t>
+      </w:r>
+    </w:p>
+    <w:p>
+      <w:pPr>
+        <w:pBdr>
+          <w:top w:val="single" w:color="EAF3FB" w:sz="2" w:space="6"/>
+          <w:bottom w:val="single" w:color="EAF3FB" w:sz="2" w:space="6"/>
+          <w:left w:val="single" w:color="2A77C6" w:sz="18" w:space="10"/>
+          <w:right w:val="single" w:color="EAF3FB" w:sz="2" w:space="6"/>
+        </w:pBdr>
+        <w:shd w:fill="EAF3FB" w:color="auto" w:val="clear"/>
+        <w:spacing w:after="140" w:before="80"/>
+      </w:pPr>
+      <w:r>
+        <w:rPr>
+          <w:b/>
+          <w:bCs/>
+          <w:color w:val="2A77C6"/>
+          <w:sz w:val="21"/>
+          <w:szCs w:val="21"/>
+        </w:rPr>
+        <w:t xml:space="preserve">Astuce — </w:t>
+      </w:r>
+      <w:r>
+        <w:rPr>
+          <w:color w:val="1B3A57"/>
+          <w:sz w:val="21"/>
+          <w:szCs w:val="21"/>
+        </w:rPr>
+        <w:t xml:space="preserve">Cette étape n'est pas obligatoire : vous pouvez très bien utiliser EduWeb dans votre navigateur. L'installer sert seulement à l'ouvrir plus vite la prochaine fois, en appuyant sur une icône, comme une application ordinaire.</w:t>
       </w:r>
     </w:p>
     <w:p>
@@ -587,7 +750,176 @@
         <w:pStyle w:val="Heading2"/>
       </w:pPr>
       <w:r>
-        <w:t xml:space="preserve">Actions par lot</w:t>
+        <w:t xml:space="preserve">Android (Chrome)</w:t>
+      </w:r>
+    </w:p>
+    <w:p>
+      <w:pPr>
+        <w:pStyle w:val="ListParagraph"/>
+        <w:numPr>
+          <w:ilvl w:val="0"/>
+          <w:numId w:val="4"/>
+        </w:numPr>
+        <w:spacing w:after="40"/>
+      </w:pPr>
+      <w:r>
+        <w:rPr>
+          <w:sz w:val="22"/>
+          <w:szCs w:val="22"/>
+        </w:rPr>
+        <w:t xml:space="preserve">Ouvrez family.eduweb.ci dans Chrome.</w:t>
+      </w:r>
+    </w:p>
+    <w:p>
+      <w:pPr>
+        <w:pStyle w:val="ListParagraph"/>
+        <w:numPr>
+          <w:ilvl w:val="0"/>
+          <w:numId w:val="4"/>
+        </w:numPr>
+        <w:spacing w:after="40"/>
+      </w:pPr>
+      <w:r>
+        <w:rPr>
+          <w:sz w:val="22"/>
+          <w:szCs w:val="22"/>
+        </w:rPr>
+        <w:t xml:space="preserve">Touchez la bannière « Installer l'application » si elle apparaît ; sinon, ouvrez le menu ⋮ (en haut à droite).</w:t>
+      </w:r>
+    </w:p>
+    <w:p>
+      <w:pPr>
+        <w:pStyle w:val="ListParagraph"/>
+        <w:numPr>
+          <w:ilvl w:val="0"/>
+          <w:numId w:val="4"/>
+        </w:numPr>
+        <w:spacing w:after="40"/>
+      </w:pPr>
+      <w:r>
+        <w:rPr>
+          <w:sz w:val="22"/>
+          <w:szCs w:val="22"/>
+        </w:rPr>
+        <w:t xml:space="preserve">Choisissez « Installer l'application » (ou « Ajouter à l'écran d'accueil »), puis confirmez.</w:t>
+      </w:r>
+    </w:p>
+    <w:p>
+      <w:pPr>
+        <w:pStyle w:val="Heading2"/>
+      </w:pPr>
+      <w:r>
+        <w:t xml:space="preserve">iPhone / iPad (Safari)</w:t>
+      </w:r>
+    </w:p>
+    <w:p>
+      <w:pPr>
+        <w:pStyle w:val="ListParagraph"/>
+        <w:numPr>
+          <w:ilvl w:val="0"/>
+          <w:numId w:val="5"/>
+        </w:numPr>
+        <w:spacing w:after="40"/>
+      </w:pPr>
+      <w:r>
+        <w:rPr>
+          <w:sz w:val="22"/>
+          <w:szCs w:val="22"/>
+        </w:rPr>
+        <w:t xml:space="preserve">Ouvrez family.eduweb.ci dans Safari.</w:t>
+      </w:r>
+    </w:p>
+    <w:p>
+      <w:pPr>
+        <w:pStyle w:val="ListParagraph"/>
+        <w:numPr>
+          <w:ilvl w:val="0"/>
+          <w:numId w:val="5"/>
+        </w:numPr>
+        <w:spacing w:after="40"/>
+      </w:pPr>
+      <w:r>
+        <w:rPr>
+          <w:sz w:val="22"/>
+          <w:szCs w:val="22"/>
+        </w:rPr>
+        <w:t xml:space="preserve">Touchez le bouton Partager (le carré surmonté d'une flèche vers le haut).</w:t>
+      </w:r>
+    </w:p>
+    <w:p>
+      <w:pPr>
+        <w:pStyle w:val="ListParagraph"/>
+        <w:numPr>
+          <w:ilvl w:val="0"/>
+          <w:numId w:val="5"/>
+        </w:numPr>
+        <w:spacing w:after="40"/>
+      </w:pPr>
+      <w:r>
+        <w:rPr>
+          <w:sz w:val="22"/>
+          <w:szCs w:val="22"/>
+        </w:rPr>
+        <w:t xml:space="preserve">Faites défiler, choisissez « Sur l'écran d'accueil », puis « Ajouter ».</w:t>
+      </w:r>
+    </w:p>
+    <w:p>
+      <w:pPr>
+        <w:pStyle w:val="Heading2"/>
+      </w:pPr>
+      <w:r>
+        <w:t xml:space="preserve">Ordinateur (Chrome ou Edge)</w:t>
+      </w:r>
+    </w:p>
+    <w:p>
+      <w:pPr>
+        <w:pStyle w:val="ListParagraph"/>
+        <w:numPr>
+          <w:ilvl w:val="0"/>
+          <w:numId w:val="6"/>
+        </w:numPr>
+        <w:spacing w:after="40"/>
+      </w:pPr>
+      <w:r>
+        <w:rPr>
+          <w:sz w:val="22"/>
+          <w:szCs w:val="22"/>
+        </w:rPr>
+        <w:t xml:space="preserve">Ouvrez family.eduweb.ci.</w:t>
+      </w:r>
+    </w:p>
+    <w:p>
+      <w:pPr>
+        <w:pStyle w:val="ListParagraph"/>
+        <w:numPr>
+          <w:ilvl w:val="0"/>
+          <w:numId w:val="6"/>
+        </w:numPr>
+        <w:spacing w:after="40"/>
+      </w:pPr>
+      <w:r>
+        <w:rPr>
+          <w:sz w:val="22"/>
+          <w:szCs w:val="22"/>
+        </w:rPr>
+        <w:t xml:space="preserve">Cliquez sur l'icône d'installation (un écran avec une flèche, ou ⊕) à droite de la barre d'adresse.</w:t>
+      </w:r>
+    </w:p>
+    <w:p>
+      <w:pPr>
+        <w:pStyle w:val="ListParagraph"/>
+        <w:numPr>
+          <w:ilvl w:val="0"/>
+          <w:numId w:val="6"/>
+        </w:numPr>
+        <w:spacing w:after="40"/>
+      </w:pPr>
+      <w:r>
+        <w:rPr>
+          <w:sz w:val="22"/>
+          <w:szCs w:val="22"/>
+        </w:rPr>
+        <w:t xml:space="preserve">Cliquez sur « Installer ».</w:t>
       </w:r>
     </w:p>
     <w:p>
@@ -599,140 +931,7 @@
           <w:sz w:val="22"/>
           <w:szCs w:val="22"/>
         </w:rPr>
-        <w:t xml:space="preserve">Cochez plusieurs comptes (ou « tout sélectionner »), puis appliquez une action groupée : Réactiver, Suspendre ou Supprimer. Vous ne pouvez pas agir sur votre propre compte.</w:t>
-      </w:r>
-    </w:p>
-    <w:p>
-      <w:pPr>
-        <w:pStyle w:val="Heading1"/>
-      </w:pPr>
-      <w:r>
-        <w:t xml:space="preserve">6.  Coachs : rechercher, consulter, modifier</w:t>
-      </w:r>
-    </w:p>
-    <w:p>
-      <w:pPr>
-        <w:spacing w:after="120"/>
-      </w:pPr>
-      <w:r>
-        <w:rPr>
-          <w:sz w:val="22"/>
-          <w:szCs w:val="22"/>
-        </w:rPr>
-        <w:t xml:space="preserve">Permission requise : « Validation des coachs ». Le bouton « Coachs » du tableau de bord ouvre la recherche.</w:t>
-      </w:r>
-    </w:p>
-    <w:p>
-      <w:pPr>
-        <w:pStyle w:val="ListParagraph"/>
-        <w:numPr>
-          <w:ilvl w:val="0"/>
-          <w:numId w:val="2"/>
-        </w:numPr>
-        <w:spacing w:after="40"/>
-      </w:pPr>
-      <w:r>
-        <w:rPr>
-          <w:sz w:val="22"/>
-          <w:szCs w:val="22"/>
-        </w:rPr>
-        <w:t xml:space="preserve">Recherchez un coach par nom ou email ; chaque résultat indique son statut et sa certification.</w:t>
-      </w:r>
-    </w:p>
-    <w:p>
-      <w:pPr>
-        <w:pStyle w:val="ListParagraph"/>
-        <w:numPr>
-          <w:ilvl w:val="0"/>
-          <w:numId w:val="2"/>
-        </w:numPr>
-        <w:spacing w:after="40"/>
-      </w:pPr>
-      <w:r>
-        <w:rPr>
-          <w:sz w:val="22"/>
-          <w:szCs w:val="22"/>
-        </w:rPr>
-        <w:t xml:space="preserve">Consulter : ouvre la fiche d'examen (identité, zone, compétences, disciplines, documents).</w:t>
-      </w:r>
-    </w:p>
-    <w:p>
-      <w:pPr>
-        <w:pStyle w:val="ListParagraph"/>
-        <w:numPr>
-          <w:ilvl w:val="0"/>
-          <w:numId w:val="2"/>
-        </w:numPr>
-        <w:spacing w:after="40"/>
-      </w:pPr>
-      <w:r>
-        <w:rPr>
-          <w:sz w:val="22"/>
-          <w:szCs w:val="22"/>
-        </w:rPr>
-        <w:t xml:space="preserve">Modifier : ouvre le profil complet du coach en mode administrateur — vous pouvez mettre à jour ses 6 sections (identité, zone, compétences, disciplines &amp; tarifs, documents, présentation), sa photo et la priorité de ses disciplines, au nom du coach.</w:t>
-      </w:r>
-    </w:p>
-    <w:p>
-      <w:pPr>
-        <w:pStyle w:val="Heading2"/>
-      </w:pPr>
-      <w:r>
-        <w:t xml:space="preserve">Validation</w:t>
-      </w:r>
-    </w:p>
-    <w:p>
-      <w:pPr>
-        <w:pStyle w:val="ListParagraph"/>
-        <w:numPr>
-          <w:ilvl w:val="0"/>
-          <w:numId w:val="2"/>
-        </w:numPr>
-        <w:spacing w:after="40"/>
-      </w:pPr>
-      <w:r>
-        <w:rPr>
-          <w:sz w:val="22"/>
-          <w:szCs w:val="22"/>
-        </w:rPr>
-        <w:t xml:space="preserve">Depuis la fiche d'examen : Valider le profil, ou Refuser avec un motif (au moins 10 caractères).</w:t>
-      </w:r>
-    </w:p>
-    <w:p>
-      <w:pPr>
-        <w:pStyle w:val="ListParagraph"/>
-        <w:numPr>
-          <w:ilvl w:val="0"/>
-          <w:numId w:val="2"/>
-        </w:numPr>
-        <w:spacing w:after="40"/>
-      </w:pPr>
-      <w:r>
-        <w:rPr>
-          <w:sz w:val="22"/>
-          <w:szCs w:val="22"/>
-        </w:rPr>
-        <w:t xml:space="preserve">Certifier (ou retirer la certification d') un coach.</w:t>
-      </w:r>
-    </w:p>
-    <w:p>
-      <w:pPr>
-        <w:pStyle w:val="Heading2"/>
-      </w:pPr>
-      <w:r>
-        <w:t xml:space="preserve">Refus groupé (au même motif)</w:t>
-      </w:r>
-    </w:p>
-    <w:p>
-      <w:pPr>
-        <w:spacing w:after="120"/>
-      </w:pPr>
-      <w:r>
-        <w:rPr>
-          <w:sz w:val="22"/>
-          <w:szCs w:val="22"/>
-        </w:rPr>
-        <w:t xml:space="preserve">Sur le tableau de bord, dans la liste « Coachs en attente de validation », cochez plusieurs coachs (ou « tout sélectionner »). Une barre apparaît : saisissez un motif commun (au moins 10 caractères) et cliquez « Refuser la sélection » pour refuser tous les coachs cochés en une seule action, avec le même motif. Pratique lorsque plusieurs candidatures sont refusées pour la même raison (ex. dossier incomplet).</w:t>
+        <w:t xml:space="preserve">Une fois installée, l'icône EduWeb apparaît sur votre écran d'accueil (ou votre bureau) et l'application se met à jour automatiquement à chaque connexion à Internet.</w:t>
       </w:r>
     </w:p>
     <w:p>
@@ -762,6 +961,243 @@
           <w:sz w:val="21"/>
           <w:szCs w:val="21"/>
         </w:rPr>
+        <w:t xml:space="preserve">En cas de coupure d'Internet, l'application affiche une page d'attente claire et se recharge automatiquement dès le retour de la connexion. La consultation des pages nécessite une connexion active.</w:t>
+      </w:r>
+    </w:p>
+    <w:p>
+      <w:pPr>
+        <w:pStyle w:val="Heading1"/>
+      </w:pPr>
+      <w:r>
+        <w:t xml:space="preserve">6.  Gestion des utilisateurs</w:t>
+      </w:r>
+    </w:p>
+    <w:p>
+      <w:pPr>
+        <w:spacing w:after="120"/>
+      </w:pPr>
+      <w:r>
+        <w:rPr>
+          <w:sz w:val="22"/>
+          <w:szCs w:val="22"/>
+        </w:rPr>
+        <w:t xml:space="preserve">Permission requise : « Gestion des utilisateurs ».</w:t>
+      </w:r>
+    </w:p>
+    <w:p>
+      <w:pPr>
+        <w:pStyle w:val="ListParagraph"/>
+        <w:numPr>
+          <w:ilvl w:val="0"/>
+          <w:numId w:val="2"/>
+        </w:numPr>
+        <w:spacing w:after="40"/>
+      </w:pPr>
+      <w:r>
+        <w:rPr>
+          <w:sz w:val="22"/>
+          <w:szCs w:val="22"/>
+        </w:rPr>
+        <w:t xml:space="preserve">Liste filtrable (parents, coachs, admins) avec recherche par nom ou email.</w:t>
+      </w:r>
+    </w:p>
+    <w:p>
+      <w:pPr>
+        <w:pStyle w:val="ListParagraph"/>
+        <w:numPr>
+          <w:ilvl w:val="0"/>
+          <w:numId w:val="2"/>
+        </w:numPr>
+        <w:spacing w:after="40"/>
+      </w:pPr>
+      <w:r>
+        <w:rPr>
+          <w:sz w:val="22"/>
+          <w:szCs w:val="22"/>
+        </w:rPr>
+        <w:t xml:space="preserve">Créer un utilisateur (activé immédiatement), changer son rôle, le suspendre/réactiver, ou le supprimer (avec ses données liées).</w:t>
+      </w:r>
+    </w:p>
+    <w:p>
+      <w:pPr>
+        <w:pStyle w:val="Heading2"/>
+      </w:pPr>
+      <w:r>
+        <w:t xml:space="preserve">Actions par lot</w:t>
+      </w:r>
+    </w:p>
+    <w:p>
+      <w:pPr>
+        <w:spacing w:after="120"/>
+      </w:pPr>
+      <w:r>
+        <w:rPr>
+          <w:sz w:val="22"/>
+          <w:szCs w:val="22"/>
+        </w:rPr>
+        <w:t xml:space="preserve">Cochez plusieurs comptes (ou « tout sélectionner »), puis appliquez une action groupée : Réactiver, Suspendre ou Supprimer. Vous ne pouvez pas agir sur votre propre compte.</w:t>
+      </w:r>
+    </w:p>
+    <w:p>
+      <w:pPr>
+        <w:pStyle w:val="Heading1"/>
+      </w:pPr>
+      <w:r>
+        <w:t xml:space="preserve">7.  Coachs : rechercher, consulter, modifier</w:t>
+      </w:r>
+    </w:p>
+    <w:p>
+      <w:pPr>
+        <w:spacing w:after="120"/>
+      </w:pPr>
+      <w:r>
+        <w:rPr>
+          <w:sz w:val="22"/>
+          <w:szCs w:val="22"/>
+        </w:rPr>
+        <w:t xml:space="preserve">Permission requise : « Validation des coachs ». Le bouton « Coachs » du tableau de bord ouvre la recherche.</w:t>
+      </w:r>
+    </w:p>
+    <w:p>
+      <w:pPr>
+        <w:pStyle w:val="ListParagraph"/>
+        <w:numPr>
+          <w:ilvl w:val="0"/>
+          <w:numId w:val="2"/>
+        </w:numPr>
+        <w:spacing w:after="40"/>
+      </w:pPr>
+      <w:r>
+        <w:rPr>
+          <w:sz w:val="22"/>
+          <w:szCs w:val="22"/>
+        </w:rPr>
+        <w:t xml:space="preserve">Recherchez un coach par nom ou email ; chaque résultat indique son statut et sa certification.</w:t>
+      </w:r>
+    </w:p>
+    <w:p>
+      <w:pPr>
+        <w:pStyle w:val="ListParagraph"/>
+        <w:numPr>
+          <w:ilvl w:val="0"/>
+          <w:numId w:val="2"/>
+        </w:numPr>
+        <w:spacing w:after="40"/>
+      </w:pPr>
+      <w:r>
+        <w:rPr>
+          <w:sz w:val="22"/>
+          <w:szCs w:val="22"/>
+        </w:rPr>
+        <w:t xml:space="preserve">Consulter : ouvre la fiche d'examen (identité, zone, compétences, disciplines, documents).</w:t>
+      </w:r>
+    </w:p>
+    <w:p>
+      <w:pPr>
+        <w:pStyle w:val="ListParagraph"/>
+        <w:numPr>
+          <w:ilvl w:val="0"/>
+          <w:numId w:val="2"/>
+        </w:numPr>
+        <w:spacing w:after="40"/>
+      </w:pPr>
+      <w:r>
+        <w:rPr>
+          <w:sz w:val="22"/>
+          <w:szCs w:val="22"/>
+        </w:rPr>
+        <w:t xml:space="preserve">Modifier : ouvre le profil complet du coach en mode administrateur — vous pouvez mettre à jour ses 6 sections (identité, zone, compétences, disciplines &amp; tarifs, documents, présentation), sa photo et la priorité de ses disciplines, au nom du coach.</w:t>
+      </w:r>
+    </w:p>
+    <w:p>
+      <w:pPr>
+        <w:pStyle w:val="Heading2"/>
+      </w:pPr>
+      <w:r>
+        <w:t xml:space="preserve">Validation</w:t>
+      </w:r>
+    </w:p>
+    <w:p>
+      <w:pPr>
+        <w:pStyle w:val="ListParagraph"/>
+        <w:numPr>
+          <w:ilvl w:val="0"/>
+          <w:numId w:val="2"/>
+        </w:numPr>
+        <w:spacing w:after="40"/>
+      </w:pPr>
+      <w:r>
+        <w:rPr>
+          <w:sz w:val="22"/>
+          <w:szCs w:val="22"/>
+        </w:rPr>
+        <w:t xml:space="preserve">Depuis la fiche d'examen : Valider le profil, ou Refuser avec un motif (au moins 10 caractères).</w:t>
+      </w:r>
+    </w:p>
+    <w:p>
+      <w:pPr>
+        <w:pStyle w:val="ListParagraph"/>
+        <w:numPr>
+          <w:ilvl w:val="0"/>
+          <w:numId w:val="2"/>
+        </w:numPr>
+        <w:spacing w:after="40"/>
+      </w:pPr>
+      <w:r>
+        <w:rPr>
+          <w:sz w:val="22"/>
+          <w:szCs w:val="22"/>
+        </w:rPr>
+        <w:t xml:space="preserve">Certifier (ou retirer la certification d') un coach.</w:t>
+      </w:r>
+    </w:p>
+    <w:p>
+      <w:pPr>
+        <w:pStyle w:val="Heading2"/>
+      </w:pPr>
+      <w:r>
+        <w:t xml:space="preserve">Refus groupé (au même motif)</w:t>
+      </w:r>
+    </w:p>
+    <w:p>
+      <w:pPr>
+        <w:spacing w:after="120"/>
+      </w:pPr>
+      <w:r>
+        <w:rPr>
+          <w:sz w:val="22"/>
+          <w:szCs w:val="22"/>
+        </w:rPr>
+        <w:t xml:space="preserve">Sur le tableau de bord, dans la liste « Coachs en attente de validation », cochez plusieurs coachs (ou « tout sélectionner »). Une barre apparaît : saisissez un motif commun (au moins 10 caractères) et cliquez « Refuser la sélection » pour refuser tous les coachs cochés en une seule action, avec le même motif. Pratique lorsque plusieurs candidatures sont refusées pour la même raison (ex. dossier incomplet).</w:t>
+      </w:r>
+    </w:p>
+    <w:p>
+      <w:pPr>
+        <w:pBdr>
+          <w:top w:val="single" w:color="E8F5EC" w:sz="2" w:space="6"/>
+          <w:bottom w:val="single" w:color="E8F5EC" w:sz="2" w:space="6"/>
+          <w:left w:val="single" w:color="1E9E57" w:sz="18" w:space="10"/>
+          <w:right w:val="single" w:color="E8F5EC" w:sz="2" w:space="6"/>
+        </w:pBdr>
+        <w:shd w:fill="E8F5EC" w:color="auto" w:val="clear"/>
+        <w:spacing w:after="140" w:before="80"/>
+      </w:pPr>
+      <w:r>
+        <w:rPr>
+          <w:b/>
+          <w:bCs/>
+          <w:color w:val="1E9E57"/>
+          <w:sz w:val="21"/>
+          <w:szCs w:val="21"/>
+        </w:rPr>
+        <w:t xml:space="preserve">À noter — </w:t>
+      </w:r>
+      <w:r>
+        <w:rPr>
+          <w:color w:val="1A3A28"/>
+          <w:sz w:val="21"/>
+          <w:szCs w:val="21"/>
+        </w:rPr>
         <w:t xml:space="preserve">Les tarifs et prétentions des coachs ne sont visibles que par l'administration.</w:t>
       </w:r>
     </w:p>
@@ -770,7 +1206,7 @@
         <w:pStyle w:val="Heading1"/>
       </w:pPr>
       <w:r>
-        <w:t xml:space="preserve">7.  Finances &amp; commissions</w:t>
+        <w:t xml:space="preserve">8.  Finances &amp; commissions</w:t>
       </w:r>
     </w:p>
     <w:p>
@@ -824,7 +1260,7 @@
         <w:pStyle w:val="Heading1"/>
       </w:pPr>
       <w:r>
-        <w:t xml:space="preserve">8.  Messagerie</w:t>
+        <w:t xml:space="preserve">9.  Messagerie</w:t>
       </w:r>
     </w:p>
     <w:p>
@@ -844,7 +1280,7 @@
         <w:pStyle w:val="Heading1"/>
       </w:pPr>
       <w:r>
-        <w:t xml:space="preserve">9.  Votre compte</w:t>
+        <w:t xml:space="preserve">10.  Votre compte</w:t>
       </w:r>
     </w:p>
     <w:p>
@@ -1143,6 +1579,18 @@
       </w:pPr>
     </w:lvl>
   </w:abstractNum>
+  <w:abstractNum w:abstractNumId="6" w15:restartNumberingAfterBreak="0">
+    <w:multiLevelType w:val="hybridMultilevel"/>
+    <w:lvl w:ilvl="0" w15:tentative="1">
+      <w:start w:val="1"/>
+      <w:numFmt w:val="decimal"/>
+      <w:lvlText w:val="%1."/>
+      <w:lvlJc w:val="left"/>
+      <w:pPr>
+        <w:ind w:left="540" w:hanging="300"/>
+      </w:pPr>
+    </w:lvl>
+  </w:abstractNum>
   <w:num w:numId="1">
     <w:abstractNumId w:val="1"/>
     <w:lvlOverride w:ilvl="0">
@@ -1169,6 +1617,12 @@
   </w:num>
   <w:num w:numId="5">
     <w:abstractNumId w:val="5"/>
+    <w:lvlOverride w:ilvl="0">
+      <w:startOverride w:val="1"/>
+    </w:lvlOverride>
+  </w:num>
+  <w:num w:numId="6">
+    <w:abstractNumId w:val="6"/>
     <w:lvlOverride w:ilvl="0">
       <w:startOverride w:val="1"/>
     </w:lvlOverride>

</xml_diff>

<commit_message>
docs(guides): reecriture pedagogique de toutes les sections metier
Chaque section metier des 5 guides est reprise dans l'esprit ultra-guide
pour grands debutants : phrase d'introduction en langage simple, etapes
numerotees explicites, jargon defini au fil du texte, encadres Astuce /
Attention / A noter. Tous les faits (tarifs, 80 %, code promo, refus groupe,
Connaissances generales, purge, etc.) sont preserves — verifie par extraction.

Petits correctifs d'affichage : caracteres « menu ⋮ » et « ⊕ » remplaces par
une description en clair (mieux pour un debutant, evite les carres vides).

Regeneration des 5 guides (PDF + Word).

Co-Authored-By: Claude Opus 4.8 (1M context) <noreply@anthropic.com>
</commit_message>
<xml_diff>
--- a/guides/Guide-Admin-EduWeb.docx
+++ b/guides/Guide-Admin-EduWeb.docx
@@ -606,36 +606,48 @@
     </w:p>
     <w:p>
       <w:pPr>
-        <w:pStyle w:val="ListParagraph"/>
-        <w:numPr>
-          <w:ilvl w:val="0"/>
-          <w:numId w:val="2"/>
-        </w:numPr>
-        <w:spacing w:after="40"/>
-      </w:pPr>
-      <w:r>
-        <w:rPr>
-          <w:sz w:val="22"/>
-          <w:szCs w:val="22"/>
-        </w:rPr>
-        <w:t xml:space="preserve">Le tableau de bord présente des statistiques en temps réel et des cartes interactives.</w:t>
-      </w:r>
-    </w:p>
-    <w:p>
-      <w:pPr>
-        <w:pStyle w:val="ListParagraph"/>
-        <w:numPr>
-          <w:ilvl w:val="0"/>
-          <w:numId w:val="2"/>
-        </w:numPr>
-        <w:spacing w:after="40"/>
-      </w:pPr>
-      <w:r>
-        <w:rPr>
-          <w:sz w:val="22"/>
-          <w:szCs w:val="22"/>
-        </w:rPr>
-        <w:t xml:space="preserve">Trois permissions possibles : Gestion des utilisateurs, Validation des coachs, Finances &amp; statistiques. Vous ne voyez que les espaces correspondant à vos permissions.</w:t>
+        <w:spacing w:after="120"/>
+      </w:pPr>
+      <w:r>
+        <w:rPr>
+          <w:sz w:val="22"/>
+          <w:szCs w:val="22"/>
+        </w:rPr>
+        <w:t xml:space="preserve">Une fois connecté, votre tableau de bord donne une vue d'ensemble de la plateforme.</w:t>
+      </w:r>
+    </w:p>
+    <w:p>
+      <w:pPr>
+        <w:pStyle w:val="ListParagraph"/>
+        <w:numPr>
+          <w:ilvl w:val="0"/>
+          <w:numId w:val="2"/>
+        </w:numPr>
+        <w:spacing w:after="40"/>
+      </w:pPr>
+      <w:r>
+        <w:rPr>
+          <w:sz w:val="22"/>
+          <w:szCs w:val="22"/>
+        </w:rPr>
+        <w:t xml:space="preserve">Il présente des statistiques en temps réel et des cartes cliquables.</w:t>
+      </w:r>
+    </w:p>
+    <w:p>
+      <w:pPr>
+        <w:pStyle w:val="ListParagraph"/>
+        <w:numPr>
+          <w:ilvl w:val="0"/>
+          <w:numId w:val="2"/>
+        </w:numPr>
+        <w:spacing w:after="40"/>
+      </w:pPr>
+      <w:r>
+        <w:rPr>
+          <w:sz w:val="22"/>
+          <w:szCs w:val="22"/>
+        </w:rPr>
+        <w:t xml:space="preserve">Trois permissions existent : Gestion des utilisateurs, Validation des coachs, Finances &amp; statistiques. Vous ne voyez que les espaces correspondant aux permissions qui vous ont été accordées.</w:t>
       </w:r>
     </w:p>
     <w:p>
@@ -784,7 +796,7 @@
           <w:sz w:val="22"/>
           <w:szCs w:val="22"/>
         </w:rPr>
-        <w:t xml:space="preserve">Touchez la bannière « Installer l'application » si elle apparaît ; sinon, ouvrez le menu ⋮ (en haut à droite).</w:t>
+        <w:t xml:space="preserve">Touchez la bannière « Installer l'application » si elle apparaît ; sinon, ouvrez le menu (les trois petits points alignés, en haut à droite).</w:t>
       </w:r>
     </w:p>
     <w:p>
@@ -902,7 +914,7 @@
           <w:sz w:val="22"/>
           <w:szCs w:val="22"/>
         </w:rPr>
-        <w:t xml:space="preserve">Cliquez sur l'icône d'installation (un écran avec une flèche, ou ⊕) à droite de la barre d'adresse.</w:t>
+        <w:t xml:space="preserve">Cliquez sur la petite icône d'installation (un écran avec une flèche vers le bas), à droite de la barre d'adresse (la barre, en haut, où l'on écrit l'adresse du site).</w:t>
       </w:r>
     </w:p>
     <w:p>
@@ -998,24 +1010,24 @@
           <w:sz w:val="22"/>
           <w:szCs w:val="22"/>
         </w:rPr>
-        <w:t xml:space="preserve">Liste filtrable (parents, coachs, admins) avec recherche par nom ou email.</w:t>
-      </w:r>
-    </w:p>
-    <w:p>
-      <w:pPr>
-        <w:pStyle w:val="ListParagraph"/>
-        <w:numPr>
-          <w:ilvl w:val="0"/>
-          <w:numId w:val="2"/>
-        </w:numPr>
-        <w:spacing w:after="40"/>
-      </w:pPr>
-      <w:r>
-        <w:rPr>
-          <w:sz w:val="22"/>
-          <w:szCs w:val="22"/>
-        </w:rPr>
-        <w:t xml:space="preserve">Créer un utilisateur (activé immédiatement), changer son rôle, le suspendre/réactiver, ou le supprimer (avec ses données liées).</w:t>
+        <w:t xml:space="preserve">La liste se filtre par rôle (parents, coachs, admins) et se recherche par nom ou e-mail.</w:t>
+      </w:r>
+    </w:p>
+    <w:p>
+      <w:pPr>
+        <w:pStyle w:val="ListParagraph"/>
+        <w:numPr>
+          <w:ilvl w:val="0"/>
+          <w:numId w:val="2"/>
+        </w:numPr>
+        <w:spacing w:after="40"/>
+      </w:pPr>
+      <w:r>
+        <w:rPr>
+          <w:sz w:val="22"/>
+          <w:szCs w:val="22"/>
+        </w:rPr>
+        <w:t xml:space="preserve">Pour chaque personne, vous pouvez : créer un compte (activé aussitôt), changer son rôle, la suspendre ou la réactiver, ou la supprimer (avec ses données liées).</w:t>
       </w:r>
     </w:p>
     <w:p>
@@ -1023,7 +1035,7 @@
         <w:pStyle w:val="Heading2"/>
       </w:pPr>
       <w:r>
-        <w:t xml:space="preserve">Actions par lot</w:t>
+        <w:t xml:space="preserve">Actions par lot (plusieurs à la fois)</w:t>
       </w:r>
     </w:p>
     <w:p>
@@ -1035,7 +1047,37 @@
           <w:sz w:val="22"/>
           <w:szCs w:val="22"/>
         </w:rPr>
-        <w:t xml:space="preserve">Cochez plusieurs comptes (ou « tout sélectionner »), puis appliquez une action groupée : Réactiver, Suspendre ou Supprimer. Vous ne pouvez pas agir sur votre propre compte.</w:t>
+        <w:t xml:space="preserve">Cochez plusieurs comptes (ou « tout sélectionner »), puis choisissez l'action groupée : Réactiver, Suspendre ou Supprimer. Vous ne pouvez pas agir sur votre propre compte.</w:t>
+      </w:r>
+    </w:p>
+    <w:p>
+      <w:pPr>
+        <w:pBdr>
+          <w:top w:val="single" w:color="EAF3FB" w:sz="2" w:space="6"/>
+          <w:bottom w:val="single" w:color="EAF3FB" w:sz="2" w:space="6"/>
+          <w:left w:val="single" w:color="2A77C6" w:sz="18" w:space="10"/>
+          <w:right w:val="single" w:color="EAF3FB" w:sz="2" w:space="6"/>
+        </w:pBdr>
+        <w:shd w:fill="EAF3FB" w:color="auto" w:val="clear"/>
+        <w:spacing w:after="140" w:before="80"/>
+      </w:pPr>
+      <w:r>
+        <w:rPr>
+          <w:b/>
+          <w:bCs/>
+          <w:color w:val="2A77C6"/>
+          <w:sz w:val="21"/>
+          <w:szCs w:val="21"/>
+        </w:rPr>
+        <w:t xml:space="preserve">Astuce — </w:t>
+      </w:r>
+      <w:r>
+        <w:rPr>
+          <w:color w:val="1B3A57"/>
+          <w:sz w:val="21"/>
+          <w:szCs w:val="21"/>
+        </w:rPr>
+        <w:t xml:space="preserve">Pour préparer un compte « tout prêt » à remettre à quelqu'un, utilisez « Créer un utilisateur » : vous pouvez générer un mot de passe et afficher les identifiants à copier (ou les envoyer par e-mail).</w:t>
       </w:r>
     </w:p>
     <w:p>
@@ -1072,41 +1114,41 @@
           <w:sz w:val="22"/>
           <w:szCs w:val="22"/>
         </w:rPr>
-        <w:t xml:space="preserve">Recherchez un coach par nom ou email ; chaque résultat indique son statut et sa certification.</w:t>
-      </w:r>
-    </w:p>
-    <w:p>
-      <w:pPr>
-        <w:pStyle w:val="ListParagraph"/>
-        <w:numPr>
-          <w:ilvl w:val="0"/>
-          <w:numId w:val="2"/>
-        </w:numPr>
-        <w:spacing w:after="40"/>
-      </w:pPr>
-      <w:r>
-        <w:rPr>
-          <w:sz w:val="22"/>
-          <w:szCs w:val="22"/>
-        </w:rPr>
-        <w:t xml:space="preserve">Consulter : ouvre la fiche d'examen (identité, zone, compétences, disciplines, documents).</w:t>
-      </w:r>
-    </w:p>
-    <w:p>
-      <w:pPr>
-        <w:pStyle w:val="ListParagraph"/>
-        <w:numPr>
-          <w:ilvl w:val="0"/>
-          <w:numId w:val="2"/>
-        </w:numPr>
-        <w:spacing w:after="40"/>
-      </w:pPr>
-      <w:r>
-        <w:rPr>
-          <w:sz w:val="22"/>
-          <w:szCs w:val="22"/>
-        </w:rPr>
-        <w:t xml:space="preserve">Modifier : ouvre le profil complet du coach en mode administrateur — vous pouvez mettre à jour ses 6 sections (identité, zone, compétences, disciplines &amp; tarifs, documents, présentation), sa photo et la priorité de ses disciplines, au nom du coach.</w:t>
+        <w:t xml:space="preserve">Recherchez un coach par nom ou e-mail ; chaque résultat indique son statut et sa certification.</w:t>
+      </w:r>
+    </w:p>
+    <w:p>
+      <w:pPr>
+        <w:pStyle w:val="ListParagraph"/>
+        <w:numPr>
+          <w:ilvl w:val="0"/>
+          <w:numId w:val="2"/>
+        </w:numPr>
+        <w:spacing w:after="40"/>
+      </w:pPr>
+      <w:r>
+        <w:rPr>
+          <w:sz w:val="22"/>
+          <w:szCs w:val="22"/>
+        </w:rPr>
+        <w:t xml:space="preserve">Consulter : ouvre sa fiche d'examen (identité, zone, compétences, disciplines, documents).</w:t>
+      </w:r>
+    </w:p>
+    <w:p>
+      <w:pPr>
+        <w:pStyle w:val="ListParagraph"/>
+        <w:numPr>
+          <w:ilvl w:val="0"/>
+          <w:numId w:val="2"/>
+        </w:numPr>
+        <w:spacing w:after="40"/>
+      </w:pPr>
+      <w:r>
+        <w:rPr>
+          <w:sz w:val="22"/>
+          <w:szCs w:val="22"/>
+        </w:rPr>
+        <w:t xml:space="preserve">Modifier : ouvre son profil complet en mode administrateur — vous pouvez mettre à jour ses 6 parties, sa photo et la priorité de ses disciplines, en son nom.</w:t>
       </w:r>
     </w:p>
     <w:p>
@@ -1114,41 +1156,41 @@
         <w:pStyle w:val="Heading2"/>
       </w:pPr>
       <w:r>
-        <w:t xml:space="preserve">Validation</w:t>
-      </w:r>
-    </w:p>
-    <w:p>
-      <w:pPr>
-        <w:pStyle w:val="ListParagraph"/>
-        <w:numPr>
-          <w:ilvl w:val="0"/>
-          <w:numId w:val="2"/>
-        </w:numPr>
-        <w:spacing w:after="40"/>
-      </w:pPr>
-      <w:r>
-        <w:rPr>
-          <w:sz w:val="22"/>
-          <w:szCs w:val="22"/>
-        </w:rPr>
-        <w:t xml:space="preserve">Depuis la fiche d'examen : Valider le profil, ou Refuser avec un motif (au moins 10 caractères).</w:t>
-      </w:r>
-    </w:p>
-    <w:p>
-      <w:pPr>
-        <w:pStyle w:val="ListParagraph"/>
-        <w:numPr>
-          <w:ilvl w:val="0"/>
-          <w:numId w:val="2"/>
-        </w:numPr>
-        <w:spacing w:after="40"/>
-      </w:pPr>
-      <w:r>
-        <w:rPr>
-          <w:sz w:val="22"/>
-          <w:szCs w:val="22"/>
-        </w:rPr>
-        <w:t xml:space="preserve">Certifier (ou retirer la certification d') un coach.</w:t>
+        <w:t xml:space="preserve">Valider ou refuser</w:t>
+      </w:r>
+    </w:p>
+    <w:p>
+      <w:pPr>
+        <w:pStyle w:val="ListParagraph"/>
+        <w:numPr>
+          <w:ilvl w:val="0"/>
+          <w:numId w:val="2"/>
+        </w:numPr>
+        <w:spacing w:after="40"/>
+      </w:pPr>
+      <w:r>
+        <w:rPr>
+          <w:sz w:val="22"/>
+          <w:szCs w:val="22"/>
+        </w:rPr>
+        <w:t xml:space="preserve">Depuis la fiche d'examen : « Valider » le profil, ou « Refuser » avec un motif (au moins 10 caractères).</w:t>
+      </w:r>
+    </w:p>
+    <w:p>
+      <w:pPr>
+        <w:pStyle w:val="ListParagraph"/>
+        <w:numPr>
+          <w:ilvl w:val="0"/>
+          <w:numId w:val="2"/>
+        </w:numPr>
+        <w:spacing w:after="40"/>
+      </w:pPr>
+      <w:r>
+        <w:rPr>
+          <w:sz w:val="22"/>
+          <w:szCs w:val="22"/>
+        </w:rPr>
+        <w:t xml:space="preserve">Vous pouvez aussi « Certifier » un coach, ou lui retirer sa certification.</w:t>
       </w:r>
     </w:p>
     <w:p>
@@ -1168,7 +1210,7 @@
           <w:sz w:val="22"/>
           <w:szCs w:val="22"/>
         </w:rPr>
-        <w:t xml:space="preserve">Sur le tableau de bord, dans la liste « Coachs en attente de validation », cochez plusieurs coachs (ou « tout sélectionner »). Une barre apparaît : saisissez un motif commun (au moins 10 caractères) et cliquez « Refuser la sélection » pour refuser tous les coachs cochés en une seule action, avec le même motif. Pratique lorsque plusieurs candidatures sont refusées pour la même raison (ex. dossier incomplet).</w:t>
+        <w:t xml:space="preserve">Sur le tableau de bord, dans la liste « Coachs en attente de validation », cochez plusieurs coachs (ou « tout sélectionner »). Une barre apparaît : saisissez un motif commun (au moins 10 caractères) et appuyez sur « Refuser la sélection ». Tous les coachs cochés sont refusés d'un coup, avec le même motif — pratique quand la raison est identique (par exemple un dossier incomplet).</w:t>
       </w:r>
     </w:p>
     <w:p>
@@ -1235,24 +1277,24 @@
           <w:sz w:val="22"/>
           <w:szCs w:val="22"/>
         </w:rPr>
-        <w:t xml:space="preserve">La page Commissions présente le récapitulatif des commissions à payer, regroupées par parrain.</w:t>
-      </w:r>
-    </w:p>
-    <w:p>
-      <w:pPr>
-        <w:pStyle w:val="ListParagraph"/>
-        <w:numPr>
-          <w:ilvl w:val="0"/>
-          <w:numId w:val="2"/>
-        </w:numPr>
-        <w:spacing w:after="40"/>
-      </w:pPr>
-      <w:r>
-        <w:rPr>
-          <w:sz w:val="22"/>
-          <w:szCs w:val="22"/>
-        </w:rPr>
-        <w:t xml:space="preserve">Marquez une commission « payée », ou réglez en une fois toutes celles d'un parrain, avant le versement réel via Mobile Money.</w:t>
+        <w:t xml:space="preserve">La page « Commissions » récapitule les commissions à payer, regroupées par parrain.</w:t>
+      </w:r>
+    </w:p>
+    <w:p>
+      <w:pPr>
+        <w:pStyle w:val="ListParagraph"/>
+        <w:numPr>
+          <w:ilvl w:val="0"/>
+          <w:numId w:val="2"/>
+        </w:numPr>
+        <w:spacing w:after="40"/>
+      </w:pPr>
+      <w:r>
+        <w:rPr>
+          <w:sz w:val="22"/>
+          <w:szCs w:val="22"/>
+        </w:rPr>
+        <w:t xml:space="preserve">Vous pouvez marquer une commission « payée », ou régler d'un coup toutes celles d'un parrain — avant d'effectuer le versement réel par Mobile Money.</w:t>
       </w:r>
     </w:p>
     <w:p>
@@ -1272,7 +1314,7 @@
           <w:sz w:val="22"/>
           <w:szCs w:val="22"/>
         </w:rPr>
-        <w:t xml:space="preserve">L'administrateur peut échanger avec tous les utilisateurs. Les utilisateurs écrivent au « Support ».</w:t>
+        <w:t xml:space="preserve">L'administrateur peut échanger avec tous les utilisateurs. De leur côté, les utilisateurs écrivent au « Support », et leurs messages vous parviennent.</w:t>
       </w:r>
     </w:p>
     <w:p>
@@ -1292,7 +1334,7 @@
           <w:sz w:val="22"/>
           <w:szCs w:val="22"/>
         </w:rPr>
-        <w:t xml:space="preserve">Depuis « Mon compte », modifiez votre mot de passe. Conservez vos identifiants en lieu sûr.</w:t>
+        <w:t xml:space="preserve">Depuis « Mon compte », vous pouvez modifier votre mot de passe. Conservez vos identifiants en lieu sûr et ne les partagez avec personne.</w:t>
       </w:r>
     </w:p>
     <w:sectPr>

</xml_diff>

<commit_message>
docs(guides): guide Admin — section 10 Editions (librairie, commandes, loterie)
Libelle de permission actualise : « Editions : librairie, commandes &
loterie des ouvrages ». Les 6 guides (docx+pdf) sont regeneres.

Co-Authored-By: Claude Fable 5 <noreply@anthropic.com>
</commit_message>
<xml_diff>
--- a/guides/Guide-Admin-EduWeb.docx
+++ b/guides/Guide-Admin-EduWeb.docx
@@ -109,7 +109,7 @@
           <w:sz w:val="16"/>
           <w:szCs w:val="16"/>
         </w:rPr>
-        <w:t xml:space="preserve">family.eduweb.ci · Version du 16 août 2026</w:t>
+        <w:t xml:space="preserve">family.eduweb.ci · Version du 31 août 2026</w:t>
       </w:r>
     </w:p>
     <w:p>
@@ -1890,6 +1890,284 @@
           <w:szCs w:val="22"/>
         </w:rPr>
         <w:t xml:space="preserve">Le simulateur de rentabilité vous permet de tester des scénarios (1 000 à 100 000 abonnés) avant de changer les tarifs.</w:t>
+      </w:r>
+    </w:p>
+    <w:p>
+      <w:pPr>
+        <w:pStyle w:val="Heading1"/>
+      </w:pPr>
+      <w:r>
+        <w:t xml:space="preserve">14.  Éditions : librairie en ligne, commandes et loterie</w:t>
+      </w:r>
+    </w:p>
+    <w:p>
+      <w:pPr>
+        <w:spacing w:after="120"/>
+      </w:pPr>
+      <w:r>
+        <w:rPr>
+          <w:sz w:val="22"/>
+          <w:szCs w:val="22"/>
+        </w:rPr>
+        <w:t xml:space="preserve">Permission requise : « Éditions : librairie, commandes &amp; loterie des ouvrages ». L'écran « Librairie des ouvrages » (menu de votre photo) gère le catalogue public /ouvrages et ses commandes.</w:t>
+      </w:r>
+    </w:p>
+    <w:p>
+      <w:pPr>
+        <w:pStyle w:val="Heading2"/>
+      </w:pPr>
+      <w:r>
+        <w:t xml:space="preserve">Composer le catalogue (nombre de livres illimité)</w:t>
+      </w:r>
+    </w:p>
+    <w:p>
+      <w:pPr>
+        <w:pStyle w:val="ListParagraph"/>
+        <w:numPr>
+          <w:ilvl w:val="0"/>
+          <w:numId w:val="11"/>
+        </w:numPr>
+        <w:spacing w:after="40"/>
+      </w:pPr>
+      <w:r>
+        <w:rPr>
+          <w:sz w:val="22"/>
+          <w:szCs w:val="22"/>
+        </w:rPr>
+        <w:t xml:space="preserve">« Ajouter un livre » : titre, niveau, sous-titre, DESCRIPTION (visible dans la librairie), PRIX en FCFA et couverture (JPG, PNG ou WebP, 3 Mo maximum — optimisée automatiquement).</w:t>
+      </w:r>
+    </w:p>
+    <w:p>
+      <w:pPr>
+        <w:pStyle w:val="ListParagraph"/>
+        <w:numPr>
+          <w:ilvl w:val="0"/>
+          <w:numId w:val="11"/>
+        </w:numPr>
+        <w:spacing w:after="40"/>
+      </w:pPr>
+      <w:r>
+        <w:rPr>
+          <w:sz w:val="22"/>
+          <w:szCs w:val="22"/>
+        </w:rPr>
+        <w:t xml:space="preserve">Le PRIX déclenche la vente : avec un prix, le bouton « Commander » apparaît sur /ouvrages ; sans prix, le livre reste en vitrine (« bientôt disponible »).</w:t>
+      </w:r>
+    </w:p>
+    <w:p>
+      <w:pPr>
+        <w:pStyle w:val="ListParagraph"/>
+        <w:numPr>
+          <w:ilvl w:val="0"/>
+          <w:numId w:val="11"/>
+        </w:numPr>
+        <w:spacing w:after="40"/>
+      </w:pPr>
+      <w:r>
+        <w:rPr>
+          <w:sz w:val="22"/>
+          <w:szCs w:val="22"/>
+        </w:rPr>
+        <w:t xml:space="preserve">L'ordre d'affichage classe le catalogue ; l'accueil du site présente les 6 premiers livres actifs, la librairie les montre tous.</w:t>
+      </w:r>
+    </w:p>
+    <w:p>
+      <w:pPr>
+        <w:pStyle w:val="ListParagraph"/>
+        <w:numPr>
+          <w:ilvl w:val="0"/>
+          <w:numId w:val="11"/>
+        </w:numPr>
+        <w:spacing w:after="40"/>
+      </w:pPr>
+      <w:r>
+        <w:rPr>
+          <w:sz w:val="22"/>
+          <w:szCs w:val="22"/>
+        </w:rPr>
+        <w:t xml:space="preserve">« Masquer » retire un livre de la vente sans le supprimer ; « Supprimer » l'efface — ses commandes déjà passées sont conservées.</w:t>
+      </w:r>
+    </w:p>
+    <w:p>
+      <w:pPr>
+        <w:pStyle w:val="Heading2"/>
+      </w:pPr>
+      <w:r>
+        <w:t xml:space="preserve">Traiter les commandes</w:t>
+      </w:r>
+    </w:p>
+    <w:p>
+      <w:pPr>
+        <w:pStyle w:val="ListParagraph"/>
+        <w:numPr>
+          <w:ilvl w:val="0"/>
+          <w:numId w:val="12"/>
+        </w:numPr>
+        <w:spacing w:after="40"/>
+      </w:pPr>
+      <w:r>
+        <w:rPr>
+          <w:sz w:val="22"/>
+          <w:szCs w:val="22"/>
+        </w:rPr>
+        <w:t xml:space="preserve">Chaque commande affiche : l'ouvrage, la quantité, le MONTANT TOTAL, le nom et le téléphone de l'acheteur, le lieu de livraison et le mode de paiement.</w:t>
+      </w:r>
+    </w:p>
+    <w:p>
+      <w:pPr>
+        <w:pStyle w:val="ListParagraph"/>
+        <w:numPr>
+          <w:ilvl w:val="0"/>
+          <w:numId w:val="12"/>
+        </w:numPr>
+        <w:spacing w:after="40"/>
+      </w:pPr>
+      <w:r>
+        <w:rPr>
+          <w:sz w:val="22"/>
+          <w:szCs w:val="22"/>
+        </w:rPr>
+        <w:t xml:space="preserve">Paiement « 📱 mobile money » : l'acheteur déclare l'opérateur et la référence de son versement — vérifiez le relevé Mobile Money AVANT de confirmer, comme pour la Formation.</w:t>
+      </w:r>
+    </w:p>
+    <w:p>
+      <w:pPr>
+        <w:pStyle w:val="ListParagraph"/>
+        <w:numPr>
+          <w:ilvl w:val="0"/>
+          <w:numId w:val="12"/>
+        </w:numPr>
+        <w:spacing w:after="40"/>
+      </w:pPr>
+      <w:r>
+        <w:rPr>
+          <w:sz w:val="22"/>
+          <w:szCs w:val="22"/>
+        </w:rPr>
+        <w:t xml:space="preserve">Paiement « 💵 à la livraison » : appelez l'acheteur au numéro indiqué pour convenir de la remise ; il règle à la réception.</w:t>
+      </w:r>
+    </w:p>
+    <w:p>
+      <w:pPr>
+        <w:pStyle w:val="ListParagraph"/>
+        <w:numPr>
+          <w:ilvl w:val="0"/>
+          <w:numId w:val="12"/>
+        </w:numPr>
+        <w:spacing w:after="40"/>
+      </w:pPr>
+      <w:r>
+        <w:rPr>
+          <w:sz w:val="22"/>
+          <w:szCs w:val="22"/>
+        </w:rPr>
+        <w:t xml:space="preserve">Le suivi se fait en un clic : « Confirmer » (commande vérifiée, en préparation) → « Livrée ». « Annuler » reste possible avant la livraison, et une commande annulée peut être rouverte.</w:t>
+      </w:r>
+    </w:p>
+    <w:p>
+      <w:pPr>
+        <w:pStyle w:val="ListParagraph"/>
+        <w:numPr>
+          <w:ilvl w:val="0"/>
+          <w:numId w:val="12"/>
+        </w:numPr>
+        <w:spacing w:after="40"/>
+      </w:pPr>
+      <w:r>
+        <w:rPr>
+          <w:sz w:val="22"/>
+          <w:szCs w:val="22"/>
+        </w:rPr>
+        <w:t xml:space="preserve">« Export CSV » télécharge toutes les commandes (tableur) pour la logistique ou la comptabilité.</w:t>
+      </w:r>
+    </w:p>
+    <w:p>
+      <w:pPr>
+        <w:pBdr>
+          <w:top w:val="single" w:color="E8F5EC" w:sz="2" w:space="6"/>
+          <w:bottom w:val="single" w:color="E8F5EC" w:sz="2" w:space="6"/>
+          <w:left w:val="single" w:color="1E9E57" w:sz="18" w:space="10"/>
+          <w:right w:val="single" w:color="E8F5EC" w:sz="2" w:space="6"/>
+        </w:pBdr>
+        <w:shd w:fill="E8F5EC" w:color="auto" w:val="clear"/>
+        <w:spacing w:after="140" w:before="80"/>
+      </w:pPr>
+      <w:r>
+        <w:rPr>
+          <w:b/>
+          <w:bCs/>
+          <w:color w:val="1E9E57"/>
+          <w:sz w:val="21"/>
+          <w:szCs w:val="21"/>
+        </w:rPr>
+        <w:t xml:space="preserve">À noter — </w:t>
+      </w:r>
+      <w:r>
+        <w:rPr>
+          <w:color w:val="1A3A28"/>
+          <w:sz w:val="21"/>
+          <w:szCs w:val="21"/>
+        </w:rPr>
+        <w:t xml:space="preserve">Les acheteurs n'ont pas besoin de compte EduWeb pour commander : le téléphone saisi est votre canal de contact. Rappelez-leur d'enregistrer le code de loterie de leur livre !</w:t>
+      </w:r>
+    </w:p>
+    <w:p>
+      <w:pPr>
+        <w:pStyle w:val="Heading2"/>
+      </w:pPr>
+      <w:r>
+        <w:t xml:space="preserve">La loterie des ouvrages</w:t>
+      </w:r>
+    </w:p>
+    <w:p>
+      <w:pPr>
+        <w:pStyle w:val="ListParagraph"/>
+        <w:numPr>
+          <w:ilvl w:val="0"/>
+          <w:numId w:val="2"/>
+        </w:numPr>
+        <w:spacing w:after="40"/>
+      </w:pPr>
+      <w:r>
+        <w:rPr>
+          <w:sz w:val="22"/>
+          <w:szCs w:val="22"/>
+        </w:rPr>
+        <w:t xml:space="preserve">L'écran « Loterie (admin) » gère les séries de codes imprimés dans les livres, les périodes de tirage, le nombre de lauréats et les notifications (e-mail, SMS, WhatsApp).</w:t>
+      </w:r>
+    </w:p>
+    <w:p>
+      <w:pPr>
+        <w:pStyle w:val="ListParagraph"/>
+        <w:numPr>
+          <w:ilvl w:val="0"/>
+          <w:numId w:val="2"/>
+        </w:numPr>
+        <w:spacing w:after="40"/>
+      </w:pPr>
+      <w:r>
+        <w:rPr>
+          <w:sz w:val="22"/>
+          <w:szCs w:val="22"/>
+        </w:rPr>
+        <w:t xml:space="preserve">Générez une nouvelle série de codes pour chaque futur ouvrage ; exportez-la en CSV pour l'imprimeur.</w:t>
+      </w:r>
+    </w:p>
+    <w:p>
+      <w:pPr>
+        <w:pStyle w:val="ListParagraph"/>
+        <w:numPr>
+          <w:ilvl w:val="0"/>
+          <w:numId w:val="2"/>
+        </w:numPr>
+        <w:spacing w:after="40"/>
+      </w:pPr>
+      <w:r>
+        <w:rPr>
+          <w:sz w:val="22"/>
+          <w:szCs w:val="22"/>
+        </w:rPr>
+        <w:t xml:space="preserve">Les tirages peuvent être lancés manuellement ou automatiquement à l'échéance ; les lauréats apparaissent avec leur statut de notification.</w:t>
       </w:r>
     </w:p>
     <w:sectPr>
@@ -2236,6 +2514,30 @@
       </w:pPr>
     </w:lvl>
   </w:abstractNum>
+  <w:abstractNum w:abstractNumId="11" w15:restartNumberingAfterBreak="0">
+    <w:multiLevelType w:val="hybridMultilevel"/>
+    <w:lvl w:ilvl="0" w15:tentative="1">
+      <w:start w:val="1"/>
+      <w:numFmt w:val="decimal"/>
+      <w:lvlText w:val="%1."/>
+      <w:lvlJc w:val="left"/>
+      <w:pPr>
+        <w:ind w:left="540" w:hanging="300"/>
+      </w:pPr>
+    </w:lvl>
+  </w:abstractNum>
+  <w:abstractNum w:abstractNumId="12" w15:restartNumberingAfterBreak="0">
+    <w:multiLevelType w:val="hybridMultilevel"/>
+    <w:lvl w:ilvl="0" w15:tentative="1">
+      <w:start w:val="1"/>
+      <w:numFmt w:val="decimal"/>
+      <w:lvlText w:val="%1."/>
+      <w:lvlJc w:val="left"/>
+      <w:pPr>
+        <w:ind w:left="540" w:hanging="300"/>
+      </w:pPr>
+    </w:lvl>
+  </w:abstractNum>
   <w:num w:numId="1">
     <w:abstractNumId w:val="1"/>
     <w:lvlOverride w:ilvl="0">
@@ -2292,6 +2594,18 @@
   </w:num>
   <w:num w:numId="10">
     <w:abstractNumId w:val="10"/>
+    <w:lvlOverride w:ilvl="0">
+      <w:startOverride w:val="1"/>
+    </w:lvlOverride>
+  </w:num>
+  <w:num w:numId="11">
+    <w:abstractNumId w:val="11"/>
+    <w:lvlOverride w:ilvl="0">
+      <w:startOverride w:val="1"/>
+    </w:lvlOverride>
+  </w:num>
+  <w:num w:numId="12">
+    <w:abstractNumId w:val="12"/>
     <w:lvlOverride w:ilvl="0">
       <w:startOverride w:val="1"/>
     </w:lvlOverride>

</xml_diff>

<commit_message>
feat(ressources): videos dans la banque + televersement direct navigateur->cloud
- Type video (mp4/webm/mov) accepte : lecteur <video> integre sur la page
  publique, bouton « Plein ecran »
- Gros fichiers (> 3,5 Mo) : televersement DIRECT navigateur -> Vercel Blob
  (les lambdas plafonnent le corps a ~4,5 Mo). Endpoint de jeton protege
  (permission Editions), types et taille (500 Mo) verifies cote serveur,
  progression affichee, bascule automatique et transparente dans le
  formulaire admin ; l'URL renvoyee est validee (domaine blob uniquement,
  mime sur liste blanche)
- Premiere video installee : « Masse et Poids — la video du chapitre »
  (Physique-Chimie Troisieme, 20,7 Mo)
- Guide Admin section 11 actualise
- Tests : 14/14 (lecteur, jeton admin/refus 302 non-admin et anonyme,
  put direct reel avec jeton, enregistrement, URL falsifiee et mime
  interdit refuses)

Co-Authored-By: Claude Fable 5 <noreply@anthropic.com>
</commit_message>
<xml_diff>
--- a/guides/Guide-Admin-EduWeb.docx
+++ b/guides/Guide-Admin-EduWeb.docx
@@ -2246,7 +2246,7 @@
           <w:sz w:val="22"/>
           <w:szCs w:val="22"/>
         </w:rPr>
-        <w:t xml:space="preserve">Deux types de contenus : un FICHIER téléversé (PDF, audio, image, Word/Excel/PowerPoint — 25 Mo max, hébergé sur le stockage cloud) OU un LIEN (page du site comme /chansons/3e, ou URL externe).</w:t>
+        <w:t xml:space="preserve">Deux types de contenus : un FICHIER téléversé (PDF, audio, VIDÉO, image, Word/Excel/PowerPoint — jusqu'à 500 Mo, hébergé sur le stockage cloud ; les gros fichiers partent automatiquement en téléversement direct avec une barre de progression) OU un LIEN (page du site comme /chansons/3e, ou URL externe).</w:t>
       </w:r>
     </w:p>
     <w:p>
@@ -2263,7 +2263,7 @@
           <w:sz w:val="22"/>
           <w:szCs w:val="22"/>
         </w:rPr>
-        <w:t xml:space="preserve">Les fichiers audio s'écoutent directement sur la page (lecteur intégré) ; les autres se téléchargent.</w:t>
+        <w:t xml:space="preserve">Les audios s'écoutent et les vidéos se regardent directement sur la page (lecteurs intégrés) ; les autres fichiers se téléchargent.</w:t>
       </w:r>
     </w:p>
     <w:p>

</xml_diff>